<commit_message>
kriptologiya masalalar yechimlari bilan
</commit_message>
<xml_diff>
--- a/Olimpiada/Kriptologiya/Masalalar yechimlari/Diffie-Helman/Diffie-Helman.docx
+++ b/Olimpiada/Kriptologiya/Masalalar yechimlari/Diffie-Helman/Diffie-Helman.docx
@@ -1,6 +1,6 @@
 
 <file path=word/document.xml><?xml version="1.0" encoding="utf-8"?>
-<w:document xmlns:wpc="http://schemas.microsoft.com/office/word/2010/wordprocessingCanvas" xmlns:cx="http://schemas.microsoft.com/office/drawing/2014/chartex" xmlns:cx1="http://schemas.microsoft.com/office/drawing/2015/9/8/chartex" xmlns:cx2="http://schemas.microsoft.com/office/drawing/2015/10/21/chartex" xmlns:cx3="http://schemas.microsoft.com/office/drawing/2016/5/9/chartex" xmlns:cx4="http://schemas.microsoft.com/office/drawing/2016/5/10/chartex" xmlns:cx5="http://schemas.microsoft.com/office/drawing/2016/5/11/chartex" xmlns:cx6="http://schemas.microsoft.com/office/drawing/2016/5/12/chartex" xmlns:cx7="http://schemas.microsoft.com/office/drawing/2016/5/13/chartex" xmlns:cx8="http://schemas.microsoft.com/office/drawing/2016/5/14/chartex" xmlns:mc="http://schemas.openxmlformats.org/markup-compatibility/2006" xmlns:aink="http://schemas.microsoft.com/office/drawing/2016/ink" xmlns:am3d="http://schemas.microsoft.com/office/drawing/2017/model3d" xmlns:o="urn:schemas-microsoft-com:office:office" xmlns:r="http://schemas.openxmlformats.org/officeDocument/2006/relationships" xmlns:m="http://schemas.openxmlformats.org/officeDocument/2006/math" xmlns:v="urn:schemas-microsoft-com:vml" xmlns:wp14="http://schemas.microsoft.com/office/word/2010/wordprocessingDrawing" xmlns:wp="http://schemas.openxmlformats.org/drawingml/2006/wordprocessingDrawing" xmlns:w10="urn:schemas-microsoft-com:office:word" xmlns:w="http://schemas.openxmlformats.org/wordprocessingml/2006/main" xmlns:w14="http://schemas.microsoft.com/office/word/2010/wordml" xmlns:w15="http://schemas.microsoft.com/office/word/2012/wordml" xmlns:w16cex="http://schemas.microsoft.com/office/word/2018/wordml/cex" xmlns:w16cid="http://schemas.microsoft.com/office/word/2016/wordml/cid" xmlns:w16="http://schemas.microsoft.com/office/word/2018/wordml" xmlns:w16se="http://schemas.microsoft.com/office/word/2015/wordml/symex" xmlns:wpg="http://schemas.microsoft.com/office/word/2010/wordprocessingGroup" xmlns:wpi="http://schemas.microsoft.com/office/word/2010/wordprocessingInk" xmlns:wne="http://schemas.microsoft.com/office/word/2006/wordml" xmlns:wps="http://schemas.microsoft.com/office/word/2010/wordprocessingShape" mc:Ignorable="w14 w15 w16se w16cid w16 w16cex wp14">
+<w:document xmlns:wpc="http://schemas.microsoft.com/office/word/2010/wordprocessingCanvas" xmlns:cx="http://schemas.microsoft.com/office/drawing/2014/chartex" xmlns:cx1="http://schemas.microsoft.com/office/drawing/2015/9/8/chartex" xmlns:cx2="http://schemas.microsoft.com/office/drawing/2015/10/21/chartex" xmlns:cx3="http://schemas.microsoft.com/office/drawing/2016/5/9/chartex" xmlns:cx4="http://schemas.microsoft.com/office/drawing/2016/5/10/chartex" xmlns:cx5="http://schemas.microsoft.com/office/drawing/2016/5/11/chartex" xmlns:cx6="http://schemas.microsoft.com/office/drawing/2016/5/12/chartex" xmlns:cx7="http://schemas.microsoft.com/office/drawing/2016/5/13/chartex" xmlns:cx8="http://schemas.microsoft.com/office/drawing/2016/5/14/chartex" xmlns:mc="http://schemas.openxmlformats.org/markup-compatibility/2006" xmlns:aink="http://schemas.microsoft.com/office/drawing/2016/ink" xmlns:am3d="http://schemas.microsoft.com/office/drawing/2017/model3d" xmlns:o="urn:schemas-microsoft-com:office:office" xmlns:r="http://schemas.openxmlformats.org/officeDocument/2006/relationships" xmlns:m="http://schemas.openxmlformats.org/officeDocument/2006/math" xmlns:v="urn:schemas-microsoft-com:vml" xmlns:wp14="http://schemas.microsoft.com/office/word/2010/wordprocessingDrawing" xmlns:wp="http://schemas.openxmlformats.org/drawingml/2006/wordprocessingDrawing" xmlns:w10="urn:schemas-microsoft-com:office:word" xmlns:w="http://schemas.openxmlformats.org/wordprocessingml/2006/main" xmlns:w14="http://schemas.microsoft.com/office/word/2010/wordml" xmlns:w15="http://schemas.microsoft.com/office/word/2012/wordml" xmlns:w16cid="http://schemas.microsoft.com/office/word/2016/wordml/cid" xmlns:w16se="http://schemas.microsoft.com/office/word/2015/wordml/symex" xmlns:wpg="http://schemas.microsoft.com/office/word/2010/wordprocessingGroup" xmlns:wpi="http://schemas.microsoft.com/office/word/2010/wordprocessingInk" xmlns:wne="http://schemas.microsoft.com/office/word/2006/wordml" xmlns:wps="http://schemas.microsoft.com/office/word/2010/wordprocessingShape" mc:Ignorable="w14 w15 w16se w16cid wp14">
   <w:body>
     <w:p>
       <w:pPr>
@@ -12,6 +12,7 @@
           <w:color w:val="0F1115"/>
           <w:sz w:val="36"/>
           <w:szCs w:val="36"/>
+          <w:lang w:val="en-US"/>
         </w:rPr>
       </w:pPr>
       <w:r>
@@ -20,6 +21,7 @@
           <w:color w:val="0F1115"/>
           <w:sz w:val="36"/>
           <w:szCs w:val="36"/>
+          <w:lang w:val="en-US"/>
         </w:rPr>
         <w:t>Diffie-Hellman Kalit Almashinuvida "O'rtadagi Shaxs" (MITM) Hujumi</w:t>
       </w:r>
@@ -241,6 +243,7 @@
           <w:color w:val="0F1115"/>
           <w:sz w:val="33"/>
           <w:szCs w:val="33"/>
+          <w:lang w:val="en-US"/>
         </w:rPr>
       </w:pPr>
       <w:r>
@@ -249,6 +252,7 @@
           <w:color w:val="0F1115"/>
           <w:sz w:val="33"/>
           <w:szCs w:val="33"/>
+          <w:lang w:val="en-US"/>
         </w:rPr>
         <w:t>1. Oddiy Diffie-Hellman Almashinuvi (MITM hujumisiz)</w:t>
       </w:r>
@@ -263,6 +267,7 @@
           <w:color w:val="0F1115"/>
           <w:sz w:val="30"/>
           <w:szCs w:val="30"/>
+          <w:lang w:val="en-US"/>
         </w:rPr>
       </w:pPr>
       <w:r>
@@ -271,6 +276,7 @@
           <w:color w:val="0F1115"/>
           <w:sz w:val="30"/>
           <w:szCs w:val="30"/>
+          <w:lang w:val="en-US"/>
         </w:rPr>
         <w:t>Kalit yaratish jarayoni:</w:t>
       </w:r>
@@ -283,6 +289,7 @@
         <w:rPr>
           <w:rFonts w:ascii="Segoe UI" w:hAnsi="Segoe UI" w:cs="Segoe UI"/>
           <w:color w:val="0F1115"/>
+          <w:lang w:val="en-US"/>
         </w:rPr>
       </w:pPr>
       <w:r>
@@ -290,6 +297,7 @@
           <w:rStyle w:val="a4"/>
           <w:rFonts w:ascii="Segoe UI" w:eastAsiaTheme="majorEastAsia" w:hAnsi="Segoe UI" w:cs="Segoe UI"/>
           <w:color w:val="0F1115"/>
+          <w:lang w:val="en-US"/>
         </w:rPr>
         <w:t>Alisa hisoblaydi</w:t>
       </w:r>
@@ -297,6 +305,7 @@
         <w:rPr>
           <w:rFonts w:ascii="Segoe UI" w:hAnsi="Segoe UI" w:cs="Segoe UI"/>
           <w:color w:val="0F1115"/>
+          <w:lang w:val="en-US"/>
         </w:rPr>
         <w:t>:</w:t>
       </w:r>
@@ -304,6 +313,7 @@
         <w:rPr>
           <w:rFonts w:ascii="Segoe UI" w:hAnsi="Segoe UI" w:cs="Segoe UI"/>
           <w:color w:val="0F1115"/>
+          <w:lang w:val="en-US"/>
         </w:rPr>
         <w:br/>
       </w:r>
@@ -314,6 +324,7 @@
           <w:sz w:val="29"/>
           <w:szCs w:val="29"/>
           <w:bdr w:val="none" w:sz="0" w:space="0" w:color="auto" w:frame="1"/>
+          <w:lang w:val="en-US"/>
         </w:rPr>
         <w:t>A=gamod  p</w:t>
       </w:r>
@@ -326,6 +337,7 @@
           <w:color w:val="0F1115"/>
           <w:sz w:val="29"/>
           <w:szCs w:val="29"/>
+          <w:lang w:val="en-US"/>
         </w:rPr>
         <w:t>A</w:t>
       </w:r>
@@ -335,6 +347,7 @@
           <w:color w:val="0F1115"/>
           <w:sz w:val="29"/>
           <w:szCs w:val="29"/>
+          <w:lang w:val="en-US"/>
         </w:rPr>
         <w:t>=</w:t>
       </w:r>
@@ -347,6 +360,7 @@
           <w:color w:val="0F1115"/>
           <w:sz w:val="29"/>
           <w:szCs w:val="29"/>
+          <w:lang w:val="en-US"/>
         </w:rPr>
         <w:t>g</w:t>
       </w:r>
@@ -359,6 +373,7 @@
           <w:color w:val="0F1115"/>
           <w:sz w:val="20"/>
           <w:szCs w:val="20"/>
+          <w:lang w:val="en-US"/>
         </w:rPr>
         <w:t>a</w:t>
       </w:r>
@@ -368,6 +383,7 @@
           <w:color w:val="0F1115"/>
           <w:sz w:val="29"/>
           <w:szCs w:val="29"/>
+          <w:lang w:val="en-US"/>
         </w:rPr>
         <w:t>mod</w:t>
       </w:r>
@@ -380,6 +396,7 @@
           <w:color w:val="0F1115"/>
           <w:sz w:val="29"/>
           <w:szCs w:val="29"/>
+          <w:lang w:val="en-US"/>
         </w:rPr>
         <w:t>p</w:t>
       </w:r>
@@ -387,6 +404,7 @@
         <w:rPr>
           <w:rFonts w:ascii="Segoe UI" w:hAnsi="Segoe UI" w:cs="Segoe UI"/>
           <w:color w:val="0F1115"/>
+          <w:lang w:val="en-US"/>
         </w:rPr>
         <w:br/>
       </w:r>
@@ -397,6 +415,7 @@
           <w:sz w:val="29"/>
           <w:szCs w:val="29"/>
           <w:bdr w:val="none" w:sz="0" w:space="0" w:color="auto" w:frame="1"/>
+          <w:lang w:val="en-US"/>
         </w:rPr>
         <w:t>A=17339mod  991=66</w:t>
       </w:r>
@@ -409,6 +428,7 @@
           <w:color w:val="0F1115"/>
           <w:sz w:val="29"/>
           <w:szCs w:val="29"/>
+          <w:lang w:val="en-US"/>
         </w:rPr>
         <w:t>A</w:t>
       </w:r>
@@ -418,6 +438,7 @@
           <w:color w:val="0F1115"/>
           <w:sz w:val="29"/>
           <w:szCs w:val="29"/>
+          <w:lang w:val="en-US"/>
         </w:rPr>
         <w:t>=</w:t>
       </w:r>
@@ -427,6 +448,7 @@
           <w:color w:val="0F1115"/>
           <w:sz w:val="29"/>
           <w:szCs w:val="29"/>
+          <w:lang w:val="en-US"/>
         </w:rPr>
         <w:t>173</w:t>
       </w:r>
@@ -436,6 +458,7 @@
           <w:color w:val="0F1115"/>
           <w:sz w:val="20"/>
           <w:szCs w:val="20"/>
+          <w:lang w:val="en-US"/>
         </w:rPr>
         <w:t>39</w:t>
       </w:r>
@@ -445,6 +468,7 @@
           <w:color w:val="0F1115"/>
           <w:sz w:val="29"/>
           <w:szCs w:val="29"/>
+          <w:lang w:val="en-US"/>
         </w:rPr>
         <w:t>mod991</w:t>
       </w:r>
@@ -454,6 +478,7 @@
           <w:color w:val="0F1115"/>
           <w:sz w:val="29"/>
           <w:szCs w:val="29"/>
+          <w:lang w:val="en-US"/>
         </w:rPr>
         <w:t>=</w:t>
       </w:r>
@@ -463,6 +488,7 @@
           <w:color w:val="0F1115"/>
           <w:sz w:val="29"/>
           <w:szCs w:val="29"/>
+          <w:lang w:val="en-US"/>
         </w:rPr>
         <w:t>66</w:t>
       </w:r>
@@ -475,6 +501,7 @@
         <w:rPr>
           <w:rFonts w:ascii="Segoe UI" w:hAnsi="Segoe UI" w:cs="Segoe UI"/>
           <w:color w:val="0F1115"/>
+          <w:lang w:val="en-US"/>
         </w:rPr>
       </w:pPr>
       <w:r>
@@ -482,6 +509,7 @@
           <w:rStyle w:val="a4"/>
           <w:rFonts w:ascii="Segoe UI" w:eastAsiaTheme="majorEastAsia" w:hAnsi="Segoe UI" w:cs="Segoe UI"/>
           <w:color w:val="0F1115"/>
+          <w:lang w:val="en-US"/>
         </w:rPr>
         <w:t>Bob hisoblaydi</w:t>
       </w:r>
@@ -489,6 +517,7 @@
         <w:rPr>
           <w:rFonts w:ascii="Segoe UI" w:hAnsi="Segoe UI" w:cs="Segoe UI"/>
           <w:color w:val="0F1115"/>
+          <w:lang w:val="en-US"/>
         </w:rPr>
         <w:t>:</w:t>
       </w:r>
@@ -496,6 +525,7 @@
         <w:rPr>
           <w:rFonts w:ascii="Segoe UI" w:hAnsi="Segoe UI" w:cs="Segoe UI"/>
           <w:color w:val="0F1115"/>
+          <w:lang w:val="en-US"/>
         </w:rPr>
         <w:br/>
       </w:r>
@@ -506,6 +536,7 @@
           <w:sz w:val="29"/>
           <w:szCs w:val="29"/>
           <w:bdr w:val="none" w:sz="0" w:space="0" w:color="auto" w:frame="1"/>
+          <w:lang w:val="en-US"/>
         </w:rPr>
         <w:t>B=gbmod  p</w:t>
       </w:r>
@@ -518,6 +549,7 @@
           <w:color w:val="0F1115"/>
           <w:sz w:val="29"/>
           <w:szCs w:val="29"/>
+          <w:lang w:val="en-US"/>
         </w:rPr>
         <w:t>B</w:t>
       </w:r>
@@ -527,6 +559,7 @@
           <w:color w:val="0F1115"/>
           <w:sz w:val="29"/>
           <w:szCs w:val="29"/>
+          <w:lang w:val="en-US"/>
         </w:rPr>
         <w:t>=</w:t>
       </w:r>
@@ -539,6 +572,7 @@
           <w:color w:val="0F1115"/>
           <w:sz w:val="29"/>
           <w:szCs w:val="29"/>
+          <w:lang w:val="en-US"/>
         </w:rPr>
         <w:t>g</w:t>
       </w:r>
@@ -551,6 +585,7 @@
           <w:color w:val="0F1115"/>
           <w:sz w:val="20"/>
           <w:szCs w:val="20"/>
+          <w:lang w:val="en-US"/>
         </w:rPr>
         <w:t>b</w:t>
       </w:r>
@@ -560,6 +595,7 @@
           <w:color w:val="0F1115"/>
           <w:sz w:val="29"/>
           <w:szCs w:val="29"/>
+          <w:lang w:val="en-US"/>
         </w:rPr>
         <w:t>mod</w:t>
       </w:r>
@@ -572,6 +608,7 @@
           <w:color w:val="0F1115"/>
           <w:sz w:val="29"/>
           <w:szCs w:val="29"/>
+          <w:lang w:val="en-US"/>
         </w:rPr>
         <w:t>p</w:t>
       </w:r>
@@ -579,6 +616,7 @@
         <w:rPr>
           <w:rFonts w:ascii="Segoe UI" w:hAnsi="Segoe UI" w:cs="Segoe UI"/>
           <w:color w:val="0F1115"/>
+          <w:lang w:val="en-US"/>
         </w:rPr>
         <w:br/>
       </w:r>
@@ -589,6 +627,7 @@
           <w:sz w:val="29"/>
           <w:szCs w:val="29"/>
           <w:bdr w:val="none" w:sz="0" w:space="0" w:color="auto" w:frame="1"/>
+          <w:lang w:val="en-US"/>
         </w:rPr>
         <w:t>B=17373mod  991=558</w:t>
       </w:r>
@@ -601,6 +640,7 @@
           <w:color w:val="0F1115"/>
           <w:sz w:val="29"/>
           <w:szCs w:val="29"/>
+          <w:lang w:val="en-US"/>
         </w:rPr>
         <w:t>B</w:t>
       </w:r>
@@ -610,6 +650,7 @@
           <w:color w:val="0F1115"/>
           <w:sz w:val="29"/>
           <w:szCs w:val="29"/>
+          <w:lang w:val="en-US"/>
         </w:rPr>
         <w:t>=</w:t>
       </w:r>
@@ -619,6 +660,7 @@
           <w:color w:val="0F1115"/>
           <w:sz w:val="29"/>
           <w:szCs w:val="29"/>
+          <w:lang w:val="en-US"/>
         </w:rPr>
         <w:t>173</w:t>
       </w:r>
@@ -628,6 +670,7 @@
           <w:color w:val="0F1115"/>
           <w:sz w:val="20"/>
           <w:szCs w:val="20"/>
+          <w:lang w:val="en-US"/>
         </w:rPr>
         <w:t>73</w:t>
       </w:r>
@@ -637,6 +680,7 @@
           <w:color w:val="0F1115"/>
           <w:sz w:val="29"/>
           <w:szCs w:val="29"/>
+          <w:lang w:val="en-US"/>
         </w:rPr>
         <w:t>mod991</w:t>
       </w:r>
@@ -646,6 +690,7 @@
           <w:color w:val="0F1115"/>
           <w:sz w:val="29"/>
           <w:szCs w:val="29"/>
+          <w:lang w:val="en-US"/>
         </w:rPr>
         <w:t>=</w:t>
       </w:r>
@@ -655,6 +700,7 @@
           <w:color w:val="0F1115"/>
           <w:sz w:val="29"/>
           <w:szCs w:val="29"/>
+          <w:lang w:val="en-US"/>
         </w:rPr>
         <w:t>558</w:t>
       </w:r>
@@ -845,6 +891,7 @@
         <w:rPr>
           <w:rFonts w:ascii="Segoe UI" w:hAnsi="Segoe UI" w:cs="Segoe UI"/>
           <w:color w:val="0F1115"/>
+          <w:lang w:val="en-US"/>
         </w:rPr>
       </w:pPr>
       <w:r>
@@ -852,6 +899,7 @@
           <w:rStyle w:val="a4"/>
           <w:rFonts w:ascii="Segoe UI" w:eastAsiaTheme="majorEastAsia" w:hAnsi="Segoe UI" w:cs="Segoe UI"/>
           <w:color w:val="0F1115"/>
+          <w:lang w:val="en-US"/>
         </w:rPr>
         <w:t>Alisa</w:t>
       </w:r>
@@ -859,6 +907,7 @@
         <w:rPr>
           <w:rFonts w:ascii="Segoe UI" w:hAnsi="Segoe UI" w:cs="Segoe UI"/>
           <w:color w:val="0F1115"/>
+          <w:lang w:val="en-US"/>
         </w:rPr>
         <w:t>:</w:t>
       </w:r>
@@ -866,6 +915,7 @@
         <w:rPr>
           <w:rFonts w:ascii="Segoe UI" w:hAnsi="Segoe UI" w:cs="Segoe UI"/>
           <w:color w:val="0F1115"/>
+          <w:lang w:val="en-US"/>
         </w:rPr>
         <w:br/>
       </w:r>
@@ -876,6 +926,7 @@
           <w:sz w:val="29"/>
           <w:szCs w:val="29"/>
           <w:bdr w:val="none" w:sz="0" w:space="0" w:color="auto" w:frame="1"/>
+          <w:lang w:val="en-US"/>
         </w:rPr>
         <w:t>K=Bamod  p</w:t>
       </w:r>
@@ -888,6 +939,7 @@
           <w:color w:val="0F1115"/>
           <w:sz w:val="29"/>
           <w:szCs w:val="29"/>
+          <w:lang w:val="en-US"/>
         </w:rPr>
         <w:t>K</w:t>
       </w:r>
@@ -897,6 +949,7 @@
           <w:color w:val="0F1115"/>
           <w:sz w:val="29"/>
           <w:szCs w:val="29"/>
+          <w:lang w:val="en-US"/>
         </w:rPr>
         <w:t>=</w:t>
       </w:r>
@@ -909,6 +962,7 @@
           <w:color w:val="0F1115"/>
           <w:sz w:val="29"/>
           <w:szCs w:val="29"/>
+          <w:lang w:val="en-US"/>
         </w:rPr>
         <w:t>B</w:t>
       </w:r>
@@ -921,6 +975,7 @@
           <w:color w:val="0F1115"/>
           <w:sz w:val="20"/>
           <w:szCs w:val="20"/>
+          <w:lang w:val="en-US"/>
         </w:rPr>
         <w:t>a</w:t>
       </w:r>
@@ -930,6 +985,7 @@
           <w:color w:val="0F1115"/>
           <w:sz w:val="29"/>
           <w:szCs w:val="29"/>
+          <w:lang w:val="en-US"/>
         </w:rPr>
         <w:t>mod</w:t>
       </w:r>
@@ -942,6 +998,7 @@
           <w:color w:val="0F1115"/>
           <w:sz w:val="29"/>
           <w:szCs w:val="29"/>
+          <w:lang w:val="en-US"/>
         </w:rPr>
         <w:t>p</w:t>
       </w:r>
@@ -949,6 +1006,7 @@
         <w:rPr>
           <w:rFonts w:ascii="Segoe UI" w:hAnsi="Segoe UI" w:cs="Segoe UI"/>
           <w:color w:val="0F1115"/>
+          <w:lang w:val="en-US"/>
         </w:rPr>
         <w:br/>
       </w:r>
@@ -959,6 +1017,7 @@
           <w:sz w:val="29"/>
           <w:szCs w:val="29"/>
           <w:bdr w:val="none" w:sz="0" w:space="0" w:color="auto" w:frame="1"/>
+          <w:lang w:val="en-US"/>
         </w:rPr>
         <w:t>K=55839mod  991=596</w:t>
       </w:r>
@@ -971,6 +1030,7 @@
           <w:color w:val="0F1115"/>
           <w:sz w:val="29"/>
           <w:szCs w:val="29"/>
+          <w:lang w:val="en-US"/>
         </w:rPr>
         <w:t>K</w:t>
       </w:r>
@@ -980,6 +1040,7 @@
           <w:color w:val="0F1115"/>
           <w:sz w:val="29"/>
           <w:szCs w:val="29"/>
+          <w:lang w:val="en-US"/>
         </w:rPr>
         <w:t>=</w:t>
       </w:r>
@@ -989,6 +1050,7 @@
           <w:color w:val="0F1115"/>
           <w:sz w:val="29"/>
           <w:szCs w:val="29"/>
+          <w:lang w:val="en-US"/>
         </w:rPr>
         <w:t>558</w:t>
       </w:r>
@@ -998,6 +1060,7 @@
           <w:color w:val="0F1115"/>
           <w:sz w:val="20"/>
           <w:szCs w:val="20"/>
+          <w:lang w:val="en-US"/>
         </w:rPr>
         <w:t>39</w:t>
       </w:r>
@@ -1007,6 +1070,7 @@
           <w:color w:val="0F1115"/>
           <w:sz w:val="29"/>
           <w:szCs w:val="29"/>
+          <w:lang w:val="en-US"/>
         </w:rPr>
         <w:t>mod991</w:t>
       </w:r>
@@ -1016,6 +1080,7 @@
           <w:color w:val="0F1115"/>
           <w:sz w:val="29"/>
           <w:szCs w:val="29"/>
+          <w:lang w:val="en-US"/>
         </w:rPr>
         <w:t>=</w:t>
       </w:r>
@@ -1025,6 +1090,7 @@
           <w:color w:val="0F1115"/>
           <w:sz w:val="29"/>
           <w:szCs w:val="29"/>
+          <w:lang w:val="en-US"/>
         </w:rPr>
         <w:t>596</w:t>
       </w:r>
@@ -1037,6 +1103,7 @@
         <w:rPr>
           <w:rFonts w:ascii="Segoe UI" w:hAnsi="Segoe UI" w:cs="Segoe UI"/>
           <w:color w:val="0F1115"/>
+          <w:lang w:val="en-US"/>
         </w:rPr>
       </w:pPr>
       <w:r>
@@ -1044,6 +1111,7 @@
           <w:rStyle w:val="a4"/>
           <w:rFonts w:ascii="Segoe UI" w:eastAsiaTheme="majorEastAsia" w:hAnsi="Segoe UI" w:cs="Segoe UI"/>
           <w:color w:val="0F1115"/>
+          <w:lang w:val="en-US"/>
         </w:rPr>
         <w:t>Bob</w:t>
       </w:r>
@@ -1051,6 +1119,7 @@
         <w:rPr>
           <w:rFonts w:ascii="Segoe UI" w:hAnsi="Segoe UI" w:cs="Segoe UI"/>
           <w:color w:val="0F1115"/>
+          <w:lang w:val="en-US"/>
         </w:rPr>
         <w:t>:</w:t>
       </w:r>
@@ -1058,6 +1127,7 @@
         <w:rPr>
           <w:rFonts w:ascii="Segoe UI" w:hAnsi="Segoe UI" w:cs="Segoe UI"/>
           <w:color w:val="0F1115"/>
+          <w:lang w:val="en-US"/>
         </w:rPr>
         <w:br/>
       </w:r>
@@ -1068,6 +1138,7 @@
           <w:sz w:val="29"/>
           <w:szCs w:val="29"/>
           <w:bdr w:val="none" w:sz="0" w:space="0" w:color="auto" w:frame="1"/>
+          <w:lang w:val="en-US"/>
         </w:rPr>
         <w:t>K=Abmod  p</w:t>
       </w:r>
@@ -1080,6 +1151,7 @@
           <w:color w:val="0F1115"/>
           <w:sz w:val="29"/>
           <w:szCs w:val="29"/>
+          <w:lang w:val="en-US"/>
         </w:rPr>
         <w:t>K</w:t>
       </w:r>
@@ -1089,6 +1161,7 @@
           <w:color w:val="0F1115"/>
           <w:sz w:val="29"/>
           <w:szCs w:val="29"/>
+          <w:lang w:val="en-US"/>
         </w:rPr>
         <w:t>=</w:t>
       </w:r>
@@ -1101,6 +1174,7 @@
           <w:color w:val="0F1115"/>
           <w:sz w:val="29"/>
           <w:szCs w:val="29"/>
+          <w:lang w:val="en-US"/>
         </w:rPr>
         <w:t>A</w:t>
       </w:r>
@@ -1113,6 +1187,7 @@
           <w:color w:val="0F1115"/>
           <w:sz w:val="20"/>
           <w:szCs w:val="20"/>
+          <w:lang w:val="en-US"/>
         </w:rPr>
         <w:t>b</w:t>
       </w:r>
@@ -1122,6 +1197,7 @@
           <w:color w:val="0F1115"/>
           <w:sz w:val="29"/>
           <w:szCs w:val="29"/>
+          <w:lang w:val="en-US"/>
         </w:rPr>
         <w:t>mod</w:t>
       </w:r>
@@ -1134,6 +1210,7 @@
           <w:color w:val="0F1115"/>
           <w:sz w:val="29"/>
           <w:szCs w:val="29"/>
+          <w:lang w:val="en-US"/>
         </w:rPr>
         <w:t>p</w:t>
       </w:r>
@@ -1141,6 +1218,7 @@
         <w:rPr>
           <w:rFonts w:ascii="Segoe UI" w:hAnsi="Segoe UI" w:cs="Segoe UI"/>
           <w:color w:val="0F1115"/>
+          <w:lang w:val="en-US"/>
         </w:rPr>
         <w:br/>
       </w:r>
@@ -1151,6 +1229,7 @@
           <w:sz w:val="29"/>
           <w:szCs w:val="29"/>
           <w:bdr w:val="none" w:sz="0" w:space="0" w:color="auto" w:frame="1"/>
+          <w:lang w:val="en-US"/>
         </w:rPr>
         <w:t>K=6673mod  991=596</w:t>
       </w:r>
@@ -1163,6 +1242,7 @@
           <w:color w:val="0F1115"/>
           <w:sz w:val="29"/>
           <w:szCs w:val="29"/>
+          <w:lang w:val="en-US"/>
         </w:rPr>
         <w:t>K</w:t>
       </w:r>
@@ -1172,6 +1252,7 @@
           <w:color w:val="0F1115"/>
           <w:sz w:val="29"/>
           <w:szCs w:val="29"/>
+          <w:lang w:val="en-US"/>
         </w:rPr>
         <w:t>=</w:t>
       </w:r>
@@ -1181,6 +1262,7 @@
           <w:color w:val="0F1115"/>
           <w:sz w:val="29"/>
           <w:szCs w:val="29"/>
+          <w:lang w:val="en-US"/>
         </w:rPr>
         <w:t>66</w:t>
       </w:r>
@@ -1190,6 +1272,7 @@
           <w:color w:val="0F1115"/>
           <w:sz w:val="20"/>
           <w:szCs w:val="20"/>
+          <w:lang w:val="en-US"/>
         </w:rPr>
         <w:t>73</w:t>
       </w:r>
@@ -1199,6 +1282,7 @@
           <w:color w:val="0F1115"/>
           <w:sz w:val="29"/>
           <w:szCs w:val="29"/>
+          <w:lang w:val="en-US"/>
         </w:rPr>
         <w:t>mod991</w:t>
       </w:r>
@@ -1208,6 +1292,7 @@
           <w:color w:val="0F1115"/>
           <w:sz w:val="29"/>
           <w:szCs w:val="29"/>
+          <w:lang w:val="en-US"/>
         </w:rPr>
         <w:t>=</w:t>
       </w:r>
@@ -1217,6 +1302,7 @@
           <w:color w:val="0F1115"/>
           <w:sz w:val="29"/>
           <w:szCs w:val="29"/>
+          <w:lang w:val="en-US"/>
         </w:rPr>
         <w:t>596</w:t>
       </w:r>
@@ -1229,6 +1315,7 @@
         <w:rPr>
           <w:rFonts w:ascii="Segoe UI" w:hAnsi="Segoe UI" w:cs="Segoe UI"/>
           <w:color w:val="0F1115"/>
+          <w:lang w:val="en-US"/>
         </w:rPr>
       </w:pPr>
       <w:r>
@@ -1236,6 +1323,7 @@
           <w:rStyle w:val="a4"/>
           <w:rFonts w:ascii="Segoe UI" w:eastAsiaTheme="majorEastAsia" w:hAnsi="Segoe UI" w:cs="Segoe UI"/>
           <w:color w:val="0F1115"/>
+          <w:lang w:val="en-US"/>
         </w:rPr>
         <w:t>Natija</w:t>
       </w:r>
@@ -1243,6 +1331,7 @@
         <w:rPr>
           <w:rFonts w:ascii="Segoe UI" w:hAnsi="Segoe UI" w:cs="Segoe UI"/>
           <w:color w:val="0F1115"/>
+          <w:lang w:val="en-US"/>
         </w:rPr>
         <w:t>: </w:t>
       </w:r>
@@ -1253,6 +1342,7 @@
           <w:sz w:val="29"/>
           <w:szCs w:val="29"/>
           <w:bdr w:val="none" w:sz="0" w:space="0" w:color="auto" w:frame="1"/>
+          <w:lang w:val="en-US"/>
         </w:rPr>
         <w:t>K=596</w:t>
       </w:r>
@@ -1265,6 +1355,7 @@
           <w:color w:val="0F1115"/>
           <w:sz w:val="29"/>
           <w:szCs w:val="29"/>
+          <w:lang w:val="en-US"/>
         </w:rPr>
         <w:t>K</w:t>
       </w:r>
@@ -1274,6 +1365,7 @@
           <w:color w:val="0F1115"/>
           <w:sz w:val="29"/>
           <w:szCs w:val="29"/>
+          <w:lang w:val="en-US"/>
         </w:rPr>
         <w:t>=</w:t>
       </w:r>
@@ -1283,6 +1375,7 @@
           <w:color w:val="0F1115"/>
           <w:sz w:val="29"/>
           <w:szCs w:val="29"/>
+          <w:lang w:val="en-US"/>
         </w:rPr>
         <w:t>596</w:t>
       </w:r>
@@ -1297,6 +1390,7 @@
           <w:color w:val="0F1115"/>
           <w:sz w:val="33"/>
           <w:szCs w:val="33"/>
+          <w:lang w:val="en-US"/>
         </w:rPr>
       </w:pPr>
       <w:r>
@@ -1305,6 +1399,7 @@
           <w:color w:val="0F1115"/>
           <w:sz w:val="33"/>
           <w:szCs w:val="33"/>
+          <w:lang w:val="en-US"/>
         </w:rPr>
         <w:t>2. MITM Hujumi Ssenariysi</w:t>
       </w:r>
@@ -1317,12 +1412,14 @@
         <w:rPr>
           <w:rFonts w:ascii="Segoe UI" w:hAnsi="Segoe UI" w:cs="Segoe UI"/>
           <w:color w:val="0F1115"/>
-        </w:rPr>
-      </w:pPr>
-      <w:r>
-        <w:rPr>
-          <w:rFonts w:ascii="Segoe UI" w:hAnsi="Segoe UI" w:cs="Segoe UI"/>
-          <w:color w:val="0F1115"/>
+          <w:lang w:val="en-US"/>
+        </w:rPr>
+      </w:pPr>
+      <w:r>
+        <w:rPr>
+          <w:rFonts w:ascii="Segoe UI" w:hAnsi="Segoe UI" w:cs="Segoe UI"/>
+          <w:color w:val="0F1115"/>
+          <w:lang w:val="en-US"/>
         </w:rPr>
         <w:lastRenderedPageBreak/>
         <w:t>Eva o'z maxfiy kalitlarini tanlaydi:</w:t>
@@ -1520,6 +1617,7 @@
         <w:rPr>
           <w:rFonts w:ascii="Segoe UI" w:hAnsi="Segoe UI" w:cs="Segoe UI"/>
           <w:color w:val="0F1115"/>
+          <w:lang w:val="en-US"/>
         </w:rPr>
       </w:pPr>
       <w:r>
@@ -1527,6 +1625,7 @@
           <w:rStyle w:val="a4"/>
           <w:rFonts w:ascii="Segoe UI" w:eastAsiaTheme="majorEastAsia" w:hAnsi="Segoe UI" w:cs="Segoe UI"/>
           <w:color w:val="0F1115"/>
+          <w:lang w:val="en-US"/>
         </w:rPr>
         <w:t>1-qadam</w:t>
       </w:r>
@@ -1534,6 +1633,7 @@
         <w:rPr>
           <w:rFonts w:ascii="Segoe UI" w:hAnsi="Segoe UI" w:cs="Segoe UI"/>
           <w:color w:val="0F1115"/>
+          <w:lang w:val="en-US"/>
         </w:rPr>
         <w:t>: Alisa → Bob (</w:t>
       </w:r>
@@ -1544,6 +1644,7 @@
           <w:sz w:val="29"/>
           <w:szCs w:val="29"/>
           <w:bdr w:val="none" w:sz="0" w:space="0" w:color="auto" w:frame="1"/>
+          <w:lang w:val="en-US"/>
         </w:rPr>
         <w:t>A=66</w:t>
       </w:r>
@@ -1556,6 +1657,7 @@
           <w:color w:val="0F1115"/>
           <w:sz w:val="29"/>
           <w:szCs w:val="29"/>
+          <w:lang w:val="en-US"/>
         </w:rPr>
         <w:t>A</w:t>
       </w:r>
@@ -1565,6 +1667,7 @@
           <w:color w:val="0F1115"/>
           <w:sz w:val="29"/>
           <w:szCs w:val="29"/>
+          <w:lang w:val="en-US"/>
         </w:rPr>
         <w:t>=</w:t>
       </w:r>
@@ -1574,6 +1677,7 @@
           <w:color w:val="0F1115"/>
           <w:sz w:val="29"/>
           <w:szCs w:val="29"/>
+          <w:lang w:val="en-US"/>
         </w:rPr>
         <w:t>66</w:t>
       </w:r>
@@ -1581,6 +1685,7 @@
         <w:rPr>
           <w:rFonts w:ascii="Segoe UI" w:hAnsi="Segoe UI" w:cs="Segoe UI"/>
           <w:color w:val="0F1115"/>
+          <w:lang w:val="en-US"/>
         </w:rPr>
         <w:t>)</w:t>
       </w:r>
@@ -1598,12 +1703,14 @@
         <w:rPr>
           <w:rFonts w:ascii="Segoe UI" w:hAnsi="Segoe UI" w:cs="Segoe UI"/>
           <w:color w:val="0F1115"/>
-        </w:rPr>
-      </w:pPr>
-      <w:r>
-        <w:rPr>
-          <w:rFonts w:ascii="Segoe UI" w:hAnsi="Segoe UI" w:cs="Segoe UI"/>
-          <w:color w:val="0F1115"/>
+          <w:lang w:val="en-US"/>
+        </w:rPr>
+      </w:pPr>
+      <w:r>
+        <w:rPr>
+          <w:rFonts w:ascii="Segoe UI" w:hAnsi="Segoe UI" w:cs="Segoe UI"/>
+          <w:color w:val="0F1115"/>
+          <w:lang w:val="en-US"/>
         </w:rPr>
         <w:t>Eva tutib oladi va hisoblaydi:</w:t>
       </w:r>
@@ -1611,6 +1718,7 @@
         <w:rPr>
           <w:rFonts w:ascii="Segoe UI" w:hAnsi="Segoe UI" w:cs="Segoe UI"/>
           <w:color w:val="0F1115"/>
+          <w:lang w:val="en-US"/>
         </w:rPr>
         <w:br/>
       </w:r>
@@ -1621,6 +1729,7 @@
           <w:sz w:val="29"/>
           <w:szCs w:val="29"/>
           <w:bdr w:val="none" w:sz="0" w:space="0" w:color="auto" w:frame="1"/>
+          <w:lang w:val="en-US"/>
         </w:rPr>
         <w:t>E1=ge1mod  p</w:t>
       </w:r>
@@ -1633,6 +1742,7 @@
           <w:color w:val="0F1115"/>
           <w:sz w:val="29"/>
           <w:szCs w:val="29"/>
+          <w:lang w:val="en-US"/>
         </w:rPr>
         <w:t>E</w:t>
       </w:r>
@@ -1642,6 +1752,7 @@
           <w:color w:val="0F1115"/>
           <w:sz w:val="20"/>
           <w:szCs w:val="20"/>
+          <w:lang w:val="en-US"/>
         </w:rPr>
         <w:t>1</w:t>
       </w:r>
@@ -1651,6 +1762,7 @@
           <w:color w:val="0F1115"/>
           <w:sz w:val="2"/>
           <w:szCs w:val="2"/>
+          <w:lang w:val="en-US"/>
         </w:rPr>
         <w:t>​</w:t>
       </w:r>
@@ -1660,6 +1772,7 @@
           <w:color w:val="0F1115"/>
           <w:sz w:val="29"/>
           <w:szCs w:val="29"/>
+          <w:lang w:val="en-US"/>
         </w:rPr>
         <w:t>=</w:t>
       </w:r>
@@ -1672,6 +1785,7 @@
           <w:color w:val="0F1115"/>
           <w:sz w:val="29"/>
           <w:szCs w:val="29"/>
+          <w:lang w:val="en-US"/>
         </w:rPr>
         <w:t>g</w:t>
       </w:r>
@@ -1684,6 +1798,7 @@
           <w:color w:val="0F1115"/>
           <w:sz w:val="20"/>
           <w:szCs w:val="20"/>
+          <w:lang w:val="en-US"/>
         </w:rPr>
         <w:t>e</w:t>
       </w:r>
@@ -1693,6 +1808,7 @@
           <w:color w:val="0F1115"/>
           <w:sz w:val="14"/>
           <w:szCs w:val="14"/>
+          <w:lang w:val="en-US"/>
         </w:rPr>
         <w:t>1</w:t>
       </w:r>
@@ -1702,6 +1818,7 @@
           <w:color w:val="0F1115"/>
           <w:sz w:val="2"/>
           <w:szCs w:val="2"/>
+          <w:lang w:val="en-US"/>
         </w:rPr>
         <w:t>​</w:t>
       </w:r>
@@ -1711,6 +1828,7 @@
           <w:color w:val="0F1115"/>
           <w:sz w:val="29"/>
           <w:szCs w:val="29"/>
+          <w:lang w:val="en-US"/>
         </w:rPr>
         <w:t>mod</w:t>
       </w:r>
@@ -1723,6 +1841,7 @@
           <w:color w:val="0F1115"/>
           <w:sz w:val="29"/>
           <w:szCs w:val="29"/>
+          <w:lang w:val="en-US"/>
         </w:rPr>
         <w:t>p</w:t>
       </w:r>
@@ -1730,6 +1849,7 @@
         <w:rPr>
           <w:rFonts w:ascii="Segoe UI" w:hAnsi="Segoe UI" w:cs="Segoe UI"/>
           <w:color w:val="0F1115"/>
+          <w:lang w:val="en-US"/>
         </w:rPr>
         <w:br/>
       </w:r>
@@ -1740,6 +1860,7 @@
           <w:sz w:val="29"/>
           <w:szCs w:val="29"/>
           <w:bdr w:val="none" w:sz="0" w:space="0" w:color="auto" w:frame="1"/>
+          <w:lang w:val="en-US"/>
         </w:rPr>
         <w:t>E1=17320mod  991=948</w:t>
       </w:r>
@@ -1752,6 +1873,7 @@
           <w:color w:val="0F1115"/>
           <w:sz w:val="29"/>
           <w:szCs w:val="29"/>
+          <w:lang w:val="en-US"/>
         </w:rPr>
         <w:t>E</w:t>
       </w:r>
@@ -1761,6 +1883,7 @@
           <w:color w:val="0F1115"/>
           <w:sz w:val="20"/>
           <w:szCs w:val="20"/>
+          <w:lang w:val="en-US"/>
         </w:rPr>
         <w:t>1</w:t>
       </w:r>
@@ -1770,6 +1893,7 @@
           <w:color w:val="0F1115"/>
           <w:sz w:val="2"/>
           <w:szCs w:val="2"/>
+          <w:lang w:val="en-US"/>
         </w:rPr>
         <w:t>​</w:t>
       </w:r>
@@ -1779,6 +1903,7 @@
           <w:color w:val="0F1115"/>
           <w:sz w:val="29"/>
           <w:szCs w:val="29"/>
+          <w:lang w:val="en-US"/>
         </w:rPr>
         <w:t>=</w:t>
       </w:r>
@@ -1788,6 +1913,7 @@
           <w:color w:val="0F1115"/>
           <w:sz w:val="29"/>
           <w:szCs w:val="29"/>
+          <w:lang w:val="en-US"/>
         </w:rPr>
         <w:t>173</w:t>
       </w:r>
@@ -1797,6 +1923,7 @@
           <w:color w:val="0F1115"/>
           <w:sz w:val="20"/>
           <w:szCs w:val="20"/>
+          <w:lang w:val="en-US"/>
         </w:rPr>
         <w:t>20</w:t>
       </w:r>
@@ -1806,6 +1933,7 @@
           <w:color w:val="0F1115"/>
           <w:sz w:val="29"/>
           <w:szCs w:val="29"/>
+          <w:lang w:val="en-US"/>
         </w:rPr>
         <w:t>mod991</w:t>
       </w:r>
@@ -1815,6 +1943,7 @@
           <w:color w:val="0F1115"/>
           <w:sz w:val="29"/>
           <w:szCs w:val="29"/>
+          <w:lang w:val="en-US"/>
         </w:rPr>
         <w:t>=</w:t>
       </w:r>
@@ -1824,6 +1953,7 @@
           <w:color w:val="0F1115"/>
           <w:sz w:val="29"/>
           <w:szCs w:val="29"/>
+          <w:lang w:val="en-US"/>
         </w:rPr>
         <w:t>948</w:t>
       </w:r>
@@ -1841,12 +1971,14 @@
         <w:rPr>
           <w:rFonts w:ascii="Segoe UI" w:hAnsi="Segoe UI" w:cs="Segoe UI"/>
           <w:color w:val="0F1115"/>
-        </w:rPr>
-      </w:pPr>
-      <w:r>
-        <w:rPr>
-          <w:rFonts w:ascii="Segoe UI" w:hAnsi="Segoe UI" w:cs="Segoe UI"/>
-          <w:color w:val="0F1115"/>
+          <w:lang w:val="en-US"/>
+        </w:rPr>
+      </w:pPr>
+      <w:r>
+        <w:rPr>
+          <w:rFonts w:ascii="Segoe UI" w:hAnsi="Segoe UI" w:cs="Segoe UI"/>
+          <w:color w:val="0F1115"/>
+          <w:lang w:val="en-US"/>
         </w:rPr>
         <w:t>Eva Alisaga </w:t>
       </w:r>
@@ -1857,6 +1989,7 @@
           <w:sz w:val="29"/>
           <w:szCs w:val="29"/>
           <w:bdr w:val="none" w:sz="0" w:space="0" w:color="auto" w:frame="1"/>
+          <w:lang w:val="en-US"/>
         </w:rPr>
         <w:t>E1=948</w:t>
       </w:r>
@@ -1869,6 +2002,7 @@
           <w:color w:val="0F1115"/>
           <w:sz w:val="29"/>
           <w:szCs w:val="29"/>
+          <w:lang w:val="en-US"/>
         </w:rPr>
         <w:t>E</w:t>
       </w:r>
@@ -1878,6 +2012,7 @@
           <w:color w:val="0F1115"/>
           <w:sz w:val="20"/>
           <w:szCs w:val="20"/>
+          <w:lang w:val="en-US"/>
         </w:rPr>
         <w:t>1</w:t>
       </w:r>
@@ -1887,6 +2022,7 @@
           <w:color w:val="0F1115"/>
           <w:sz w:val="2"/>
           <w:szCs w:val="2"/>
+          <w:lang w:val="en-US"/>
         </w:rPr>
         <w:t>​</w:t>
       </w:r>
@@ -1896,6 +2032,7 @@
           <w:color w:val="0F1115"/>
           <w:sz w:val="29"/>
           <w:szCs w:val="29"/>
+          <w:lang w:val="en-US"/>
         </w:rPr>
         <w:t>=</w:t>
       </w:r>
@@ -1905,6 +2042,7 @@
           <w:color w:val="0F1115"/>
           <w:sz w:val="29"/>
           <w:szCs w:val="29"/>
+          <w:lang w:val="en-US"/>
         </w:rPr>
         <w:t>948</w:t>
       </w:r>
@@ -1912,6 +2050,7 @@
         <w:rPr>
           <w:rFonts w:ascii="Segoe UI" w:hAnsi="Segoe UI" w:cs="Segoe UI"/>
           <w:color w:val="0F1115"/>
+          <w:lang w:val="en-US"/>
         </w:rPr>
         <w:t> ni yuboradi</w:t>
       </w:r>
@@ -1924,6 +2063,7 @@
         <w:rPr>
           <w:rFonts w:ascii="Segoe UI" w:hAnsi="Segoe UI" w:cs="Segoe UI"/>
           <w:color w:val="0F1115"/>
+          <w:lang w:val="en-US"/>
         </w:rPr>
       </w:pPr>
       <w:r>
@@ -1931,6 +2071,7 @@
           <w:rStyle w:val="a4"/>
           <w:rFonts w:ascii="Segoe UI" w:eastAsiaTheme="majorEastAsia" w:hAnsi="Segoe UI" w:cs="Segoe UI"/>
           <w:color w:val="0F1115"/>
+          <w:lang w:val="en-US"/>
         </w:rPr>
         <w:t>2-qadam</w:t>
       </w:r>
@@ -1938,6 +2079,7 @@
         <w:rPr>
           <w:rFonts w:ascii="Segoe UI" w:hAnsi="Segoe UI" w:cs="Segoe UI"/>
           <w:color w:val="0F1115"/>
+          <w:lang w:val="en-US"/>
         </w:rPr>
         <w:t>: Bob → Alisa (</w:t>
       </w:r>
@@ -1948,6 +2090,7 @@
           <w:sz w:val="29"/>
           <w:szCs w:val="29"/>
           <w:bdr w:val="none" w:sz="0" w:space="0" w:color="auto" w:frame="1"/>
+          <w:lang w:val="en-US"/>
         </w:rPr>
         <w:t>B=558</w:t>
       </w:r>
@@ -1960,6 +2103,7 @@
           <w:color w:val="0F1115"/>
           <w:sz w:val="29"/>
           <w:szCs w:val="29"/>
+          <w:lang w:val="en-US"/>
         </w:rPr>
         <w:t>B</w:t>
       </w:r>
@@ -1969,6 +2113,7 @@
           <w:color w:val="0F1115"/>
           <w:sz w:val="29"/>
           <w:szCs w:val="29"/>
+          <w:lang w:val="en-US"/>
         </w:rPr>
         <w:t>=</w:t>
       </w:r>
@@ -1978,6 +2123,7 @@
           <w:color w:val="0F1115"/>
           <w:sz w:val="29"/>
           <w:szCs w:val="29"/>
+          <w:lang w:val="en-US"/>
         </w:rPr>
         <w:t>558</w:t>
       </w:r>
@@ -1985,6 +2131,7 @@
         <w:rPr>
           <w:rFonts w:ascii="Segoe UI" w:hAnsi="Segoe UI" w:cs="Segoe UI"/>
           <w:color w:val="0F1115"/>
+          <w:lang w:val="en-US"/>
         </w:rPr>
         <w:t>)</w:t>
       </w:r>
@@ -2002,12 +2149,14 @@
         <w:rPr>
           <w:rFonts w:ascii="Segoe UI" w:hAnsi="Segoe UI" w:cs="Segoe UI"/>
           <w:color w:val="0F1115"/>
-        </w:rPr>
-      </w:pPr>
-      <w:r>
-        <w:rPr>
-          <w:rFonts w:ascii="Segoe UI" w:hAnsi="Segoe UI" w:cs="Segoe UI"/>
-          <w:color w:val="0F1115"/>
+          <w:lang w:val="en-US"/>
+        </w:rPr>
+      </w:pPr>
+      <w:r>
+        <w:rPr>
+          <w:rFonts w:ascii="Segoe UI" w:hAnsi="Segoe UI" w:cs="Segoe UI"/>
+          <w:color w:val="0F1115"/>
+          <w:lang w:val="en-US"/>
         </w:rPr>
         <w:t>Eva tutib oladi va hisoblaydi:</w:t>
       </w:r>
@@ -2015,6 +2164,7 @@
         <w:rPr>
           <w:rFonts w:ascii="Segoe UI" w:hAnsi="Segoe UI" w:cs="Segoe UI"/>
           <w:color w:val="0F1115"/>
+          <w:lang w:val="en-US"/>
         </w:rPr>
         <w:br/>
       </w:r>
@@ -2025,6 +2175,7 @@
           <w:sz w:val="29"/>
           <w:szCs w:val="29"/>
           <w:bdr w:val="none" w:sz="0" w:space="0" w:color="auto" w:frame="1"/>
+          <w:lang w:val="en-US"/>
         </w:rPr>
         <w:t>E2=ge2mod  p</w:t>
       </w:r>
@@ -2037,6 +2188,7 @@
           <w:color w:val="0F1115"/>
           <w:sz w:val="29"/>
           <w:szCs w:val="29"/>
+          <w:lang w:val="en-US"/>
         </w:rPr>
         <w:t>E</w:t>
       </w:r>
@@ -2046,6 +2198,7 @@
           <w:color w:val="0F1115"/>
           <w:sz w:val="20"/>
           <w:szCs w:val="20"/>
+          <w:lang w:val="en-US"/>
         </w:rPr>
         <w:t>2</w:t>
       </w:r>
@@ -2055,6 +2208,7 @@
           <w:color w:val="0F1115"/>
           <w:sz w:val="2"/>
           <w:szCs w:val="2"/>
+          <w:lang w:val="en-US"/>
         </w:rPr>
         <w:t>​</w:t>
       </w:r>
@@ -2064,6 +2218,7 @@
           <w:color w:val="0F1115"/>
           <w:sz w:val="29"/>
           <w:szCs w:val="29"/>
+          <w:lang w:val="en-US"/>
         </w:rPr>
         <w:t>=</w:t>
       </w:r>
@@ -2076,6 +2231,7 @@
           <w:color w:val="0F1115"/>
           <w:sz w:val="29"/>
           <w:szCs w:val="29"/>
+          <w:lang w:val="en-US"/>
         </w:rPr>
         <w:t>g</w:t>
       </w:r>
@@ -2088,6 +2244,7 @@
           <w:color w:val="0F1115"/>
           <w:sz w:val="20"/>
           <w:szCs w:val="20"/>
+          <w:lang w:val="en-US"/>
         </w:rPr>
         <w:t>e</w:t>
       </w:r>
@@ -2097,6 +2254,7 @@
           <w:color w:val="0F1115"/>
           <w:sz w:val="14"/>
           <w:szCs w:val="14"/>
+          <w:lang w:val="en-US"/>
         </w:rPr>
         <w:t>2</w:t>
       </w:r>
@@ -2106,6 +2264,7 @@
           <w:color w:val="0F1115"/>
           <w:sz w:val="2"/>
           <w:szCs w:val="2"/>
+          <w:lang w:val="en-US"/>
         </w:rPr>
         <w:t>​</w:t>
       </w:r>
@@ -2115,6 +2274,7 @@
           <w:color w:val="0F1115"/>
           <w:sz w:val="29"/>
           <w:szCs w:val="29"/>
+          <w:lang w:val="en-US"/>
         </w:rPr>
         <w:t>mod</w:t>
       </w:r>
@@ -2127,6 +2287,7 @@
           <w:color w:val="0F1115"/>
           <w:sz w:val="29"/>
           <w:szCs w:val="29"/>
+          <w:lang w:val="en-US"/>
         </w:rPr>
         <w:t>p</w:t>
       </w:r>
@@ -2134,6 +2295,7 @@
         <w:rPr>
           <w:rFonts w:ascii="Segoe UI" w:hAnsi="Segoe UI" w:cs="Segoe UI"/>
           <w:color w:val="0F1115"/>
+          <w:lang w:val="en-US"/>
         </w:rPr>
         <w:br/>
       </w:r>
@@ -2144,6 +2306,7 @@
           <w:sz w:val="29"/>
           <w:szCs w:val="29"/>
           <w:bdr w:val="none" w:sz="0" w:space="0" w:color="auto" w:frame="1"/>
+          <w:lang w:val="en-US"/>
         </w:rPr>
         <w:t>E2=17345mod  991=460</w:t>
       </w:r>
@@ -2156,6 +2319,7 @@
           <w:color w:val="0F1115"/>
           <w:sz w:val="29"/>
           <w:szCs w:val="29"/>
+          <w:lang w:val="en-US"/>
         </w:rPr>
         <w:t>E</w:t>
       </w:r>
@@ -2165,6 +2329,7 @@
           <w:color w:val="0F1115"/>
           <w:sz w:val="20"/>
           <w:szCs w:val="20"/>
+          <w:lang w:val="en-US"/>
         </w:rPr>
         <w:t>2</w:t>
       </w:r>
@@ -2174,6 +2339,7 @@
           <w:color w:val="0F1115"/>
           <w:sz w:val="2"/>
           <w:szCs w:val="2"/>
+          <w:lang w:val="en-US"/>
         </w:rPr>
         <w:t>​</w:t>
       </w:r>
@@ -2183,6 +2349,7 @@
           <w:color w:val="0F1115"/>
           <w:sz w:val="29"/>
           <w:szCs w:val="29"/>
+          <w:lang w:val="en-US"/>
         </w:rPr>
         <w:t>=</w:t>
       </w:r>
@@ -2192,6 +2359,7 @@
           <w:color w:val="0F1115"/>
           <w:sz w:val="29"/>
           <w:szCs w:val="29"/>
+          <w:lang w:val="en-US"/>
         </w:rPr>
         <w:t>173</w:t>
       </w:r>
@@ -2201,6 +2369,7 @@
           <w:color w:val="0F1115"/>
           <w:sz w:val="20"/>
           <w:szCs w:val="20"/>
+          <w:lang w:val="en-US"/>
         </w:rPr>
         <w:t>45</w:t>
       </w:r>
@@ -2210,6 +2379,7 @@
           <w:color w:val="0F1115"/>
           <w:sz w:val="29"/>
           <w:szCs w:val="29"/>
+          <w:lang w:val="en-US"/>
         </w:rPr>
         <w:t>mod991</w:t>
       </w:r>
@@ -2219,6 +2389,7 @@
           <w:color w:val="0F1115"/>
           <w:sz w:val="29"/>
           <w:szCs w:val="29"/>
+          <w:lang w:val="en-US"/>
         </w:rPr>
         <w:t>=</w:t>
       </w:r>
@@ -2228,6 +2399,7 @@
           <w:color w:val="0F1115"/>
           <w:sz w:val="29"/>
           <w:szCs w:val="29"/>
+          <w:lang w:val="en-US"/>
         </w:rPr>
         <w:t>460</w:t>
       </w:r>
@@ -2245,12 +2417,14 @@
         <w:rPr>
           <w:rFonts w:ascii="Segoe UI" w:hAnsi="Segoe UI" w:cs="Segoe UI"/>
           <w:color w:val="0F1115"/>
-        </w:rPr>
-      </w:pPr>
-      <w:r>
-        <w:rPr>
-          <w:rFonts w:ascii="Segoe UI" w:hAnsi="Segoe UI" w:cs="Segoe UI"/>
-          <w:color w:val="0F1115"/>
+          <w:lang w:val="en-US"/>
+        </w:rPr>
+      </w:pPr>
+      <w:r>
+        <w:rPr>
+          <w:rFonts w:ascii="Segoe UI" w:hAnsi="Segoe UI" w:cs="Segoe UI"/>
+          <w:color w:val="0F1115"/>
+          <w:lang w:val="en-US"/>
         </w:rPr>
         <w:t>Eva Bobga </w:t>
       </w:r>
@@ -2261,6 +2435,7 @@
           <w:sz w:val="29"/>
           <w:szCs w:val="29"/>
           <w:bdr w:val="none" w:sz="0" w:space="0" w:color="auto" w:frame="1"/>
+          <w:lang w:val="en-US"/>
         </w:rPr>
         <w:t>E2=460</w:t>
       </w:r>
@@ -2273,6 +2448,7 @@
           <w:color w:val="0F1115"/>
           <w:sz w:val="29"/>
           <w:szCs w:val="29"/>
+          <w:lang w:val="en-US"/>
         </w:rPr>
         <w:t>E</w:t>
       </w:r>
@@ -2282,6 +2458,7 @@
           <w:color w:val="0F1115"/>
           <w:sz w:val="20"/>
           <w:szCs w:val="20"/>
+          <w:lang w:val="en-US"/>
         </w:rPr>
         <w:t>2</w:t>
       </w:r>
@@ -2291,6 +2468,7 @@
           <w:color w:val="0F1115"/>
           <w:sz w:val="2"/>
           <w:szCs w:val="2"/>
+          <w:lang w:val="en-US"/>
         </w:rPr>
         <w:t>​</w:t>
       </w:r>
@@ -2300,6 +2478,7 @@
           <w:color w:val="0F1115"/>
           <w:sz w:val="29"/>
           <w:szCs w:val="29"/>
+          <w:lang w:val="en-US"/>
         </w:rPr>
         <w:t>=</w:t>
       </w:r>
@@ -2309,6 +2488,7 @@
           <w:color w:val="0F1115"/>
           <w:sz w:val="29"/>
           <w:szCs w:val="29"/>
+          <w:lang w:val="en-US"/>
         </w:rPr>
         <w:t>460</w:t>
       </w:r>
@@ -2316,6 +2496,7 @@
         <w:rPr>
           <w:rFonts w:ascii="Segoe UI" w:hAnsi="Segoe UI" w:cs="Segoe UI"/>
           <w:color w:val="0F1115"/>
+          <w:lang w:val="en-US"/>
         </w:rPr>
         <w:t> ni yuboradi</w:t>
       </w:r>
@@ -2330,6 +2511,7 @@
           <w:color w:val="0F1115"/>
           <w:sz w:val="30"/>
           <w:szCs w:val="30"/>
+          <w:lang w:val="en-US"/>
         </w:rPr>
       </w:pPr>
       <w:r>
@@ -2338,6 +2520,7 @@
           <w:color w:val="0F1115"/>
           <w:sz w:val="30"/>
           <w:szCs w:val="30"/>
+          <w:lang w:val="en-US"/>
         </w:rPr>
         <w:t>Hosil bo'ladigan kalitlar:</w:t>
       </w:r>
@@ -2350,6 +2533,7 @@
         <w:rPr>
           <w:rFonts w:ascii="Segoe UI" w:hAnsi="Segoe UI" w:cs="Segoe UI"/>
           <w:color w:val="0F1115"/>
+          <w:lang w:val="en-US"/>
         </w:rPr>
       </w:pPr>
       <w:r>
@@ -2357,6 +2541,7 @@
           <w:rStyle w:val="a4"/>
           <w:rFonts w:ascii="Segoe UI" w:eastAsiaTheme="majorEastAsia" w:hAnsi="Segoe UI" w:cs="Segoe UI"/>
           <w:color w:val="0F1115"/>
+          <w:lang w:val="en-US"/>
         </w:rPr>
         <w:t>Alisa ↔ Eva kaliti</w:t>
       </w:r>
@@ -2364,6 +2549,7 @@
         <w:rPr>
           <w:rFonts w:ascii="Segoe UI" w:hAnsi="Segoe UI" w:cs="Segoe UI"/>
           <w:color w:val="0F1115"/>
+          <w:lang w:val="en-US"/>
         </w:rPr>
         <w:t>:</w:t>
       </w:r>
@@ -2376,6 +2562,7 @@
         <w:rPr>
           <w:rFonts w:ascii="Segoe UI" w:hAnsi="Segoe UI" w:cs="Segoe UI"/>
           <w:color w:val="0F1115"/>
+          <w:lang w:val="en-US"/>
         </w:rPr>
       </w:pPr>
       <w:r>
@@ -2383,6 +2570,7 @@
           <w:rStyle w:val="a4"/>
           <w:rFonts w:ascii="Segoe UI" w:eastAsiaTheme="majorEastAsia" w:hAnsi="Segoe UI" w:cs="Segoe UI"/>
           <w:color w:val="0F1115"/>
+          <w:lang w:val="en-US"/>
         </w:rPr>
         <w:t>Alisa tomondan</w:t>
       </w:r>
@@ -2390,6 +2578,7 @@
         <w:rPr>
           <w:rFonts w:ascii="Segoe UI" w:hAnsi="Segoe UI" w:cs="Segoe UI"/>
           <w:color w:val="0F1115"/>
+          <w:lang w:val="en-US"/>
         </w:rPr>
         <w:t>:</w:t>
       </w:r>
@@ -2397,6 +2586,7 @@
         <w:rPr>
           <w:rFonts w:ascii="Segoe UI" w:hAnsi="Segoe UI" w:cs="Segoe UI"/>
           <w:color w:val="0F1115"/>
+          <w:lang w:val="en-US"/>
         </w:rPr>
         <w:br/>
       </w:r>
@@ -2407,6 +2597,7 @@
           <w:sz w:val="29"/>
           <w:szCs w:val="29"/>
           <w:bdr w:val="none" w:sz="0" w:space="0" w:color="auto" w:frame="1"/>
+          <w:lang w:val="en-US"/>
         </w:rPr>
         <w:t>KAE=E1amod  p</w:t>
       </w:r>
@@ -2419,6 +2610,7 @@
           <w:color w:val="0F1115"/>
           <w:sz w:val="29"/>
           <w:szCs w:val="29"/>
+          <w:lang w:val="en-US"/>
         </w:rPr>
         <w:t>K</w:t>
       </w:r>
@@ -2431,6 +2623,7 @@
           <w:color w:val="0F1115"/>
           <w:sz w:val="20"/>
           <w:szCs w:val="20"/>
+          <w:lang w:val="en-US"/>
         </w:rPr>
         <w:t>AE</w:t>
       </w:r>
@@ -2440,6 +2633,7 @@
           <w:color w:val="0F1115"/>
           <w:sz w:val="2"/>
           <w:szCs w:val="2"/>
+          <w:lang w:val="en-US"/>
         </w:rPr>
         <w:t>​</w:t>
       </w:r>
@@ -2449,6 +2643,7 @@
           <w:color w:val="0F1115"/>
           <w:sz w:val="29"/>
           <w:szCs w:val="29"/>
+          <w:lang w:val="en-US"/>
         </w:rPr>
         <w:t>=</w:t>
       </w:r>
@@ -2461,6 +2656,7 @@
           <w:color w:val="0F1115"/>
           <w:sz w:val="29"/>
           <w:szCs w:val="29"/>
+          <w:lang w:val="en-US"/>
         </w:rPr>
         <w:t>E</w:t>
       </w:r>
@@ -2470,6 +2666,7 @@
           <w:color w:val="0F1115"/>
           <w:sz w:val="20"/>
           <w:szCs w:val="20"/>
+          <w:lang w:val="en-US"/>
         </w:rPr>
         <w:t>1</w:t>
       </w:r>
@@ -2482,6 +2679,7 @@
           <w:color w:val="0F1115"/>
           <w:sz w:val="20"/>
           <w:szCs w:val="20"/>
+          <w:lang w:val="en-US"/>
         </w:rPr>
         <w:t>a</w:t>
       </w:r>
@@ -2491,6 +2689,7 @@
           <w:color w:val="0F1115"/>
           <w:sz w:val="2"/>
           <w:szCs w:val="2"/>
+          <w:lang w:val="en-US"/>
         </w:rPr>
         <w:t>​</w:t>
       </w:r>
@@ -2500,6 +2699,7 @@
           <w:color w:val="0F1115"/>
           <w:sz w:val="29"/>
           <w:szCs w:val="29"/>
+          <w:lang w:val="en-US"/>
         </w:rPr>
         <w:t>mod</w:t>
       </w:r>
@@ -2512,6 +2712,7 @@
           <w:color w:val="0F1115"/>
           <w:sz w:val="29"/>
           <w:szCs w:val="29"/>
+          <w:lang w:val="en-US"/>
         </w:rPr>
         <w:t>p</w:t>
       </w:r>
@@ -2519,6 +2720,7 @@
         <w:rPr>
           <w:rFonts w:ascii="Segoe UI" w:hAnsi="Segoe UI" w:cs="Segoe UI"/>
           <w:color w:val="0F1115"/>
+          <w:lang w:val="en-US"/>
         </w:rPr>
         <w:br/>
       </w:r>
@@ -2529,6 +2731,7 @@
           <w:sz w:val="29"/>
           <w:szCs w:val="29"/>
           <w:bdr w:val="none" w:sz="0" w:space="0" w:color="auto" w:frame="1"/>
+          <w:lang w:val="en-US"/>
         </w:rPr>
         <w:t>KAE=94839mod  991=592</w:t>
       </w:r>
@@ -2541,6 +2744,7 @@
           <w:color w:val="0F1115"/>
           <w:sz w:val="29"/>
           <w:szCs w:val="29"/>
+          <w:lang w:val="en-US"/>
         </w:rPr>
         <w:t>K</w:t>
       </w:r>
@@ -2553,6 +2757,7 @@
           <w:color w:val="0F1115"/>
           <w:sz w:val="20"/>
           <w:szCs w:val="20"/>
+          <w:lang w:val="en-US"/>
         </w:rPr>
         <w:t>AE</w:t>
       </w:r>
@@ -2562,6 +2767,7 @@
           <w:color w:val="0F1115"/>
           <w:sz w:val="2"/>
           <w:szCs w:val="2"/>
+          <w:lang w:val="en-US"/>
         </w:rPr>
         <w:t>​</w:t>
       </w:r>
@@ -2571,6 +2777,7 @@
           <w:color w:val="0F1115"/>
           <w:sz w:val="29"/>
           <w:szCs w:val="29"/>
+          <w:lang w:val="en-US"/>
         </w:rPr>
         <w:t>=</w:t>
       </w:r>
@@ -2580,6 +2787,7 @@
           <w:color w:val="0F1115"/>
           <w:sz w:val="29"/>
           <w:szCs w:val="29"/>
+          <w:lang w:val="en-US"/>
         </w:rPr>
         <w:t>948</w:t>
       </w:r>
@@ -2589,6 +2797,7 @@
           <w:color w:val="0F1115"/>
           <w:sz w:val="20"/>
           <w:szCs w:val="20"/>
+          <w:lang w:val="en-US"/>
         </w:rPr>
         <w:t>39</w:t>
       </w:r>
@@ -2598,6 +2807,7 @@
           <w:color w:val="0F1115"/>
           <w:sz w:val="29"/>
           <w:szCs w:val="29"/>
+          <w:lang w:val="en-US"/>
         </w:rPr>
         <w:t>mod991</w:t>
       </w:r>
@@ -2607,6 +2817,7 @@
           <w:color w:val="0F1115"/>
           <w:sz w:val="29"/>
           <w:szCs w:val="29"/>
+          <w:lang w:val="en-US"/>
         </w:rPr>
         <w:t>=</w:t>
       </w:r>
@@ -2616,6 +2827,7 @@
           <w:color w:val="0F1115"/>
           <w:sz w:val="29"/>
           <w:szCs w:val="29"/>
+          <w:lang w:val="en-US"/>
         </w:rPr>
         <w:t>592</w:t>
       </w:r>
@@ -2628,6 +2840,7 @@
         <w:rPr>
           <w:rFonts w:ascii="Segoe UI" w:hAnsi="Segoe UI" w:cs="Segoe UI"/>
           <w:color w:val="0F1115"/>
+          <w:lang w:val="en-US"/>
         </w:rPr>
       </w:pPr>
       <w:r>
@@ -2635,6 +2848,7 @@
           <w:rStyle w:val="a4"/>
           <w:rFonts w:ascii="Segoe UI" w:eastAsiaTheme="majorEastAsia" w:hAnsi="Segoe UI" w:cs="Segoe UI"/>
           <w:color w:val="0F1115"/>
+          <w:lang w:val="en-US"/>
         </w:rPr>
         <w:t>Eva tomondan</w:t>
       </w:r>
@@ -2642,6 +2856,7 @@
         <w:rPr>
           <w:rFonts w:ascii="Segoe UI" w:hAnsi="Segoe UI" w:cs="Segoe UI"/>
           <w:color w:val="0F1115"/>
+          <w:lang w:val="en-US"/>
         </w:rPr>
         <w:t>:</w:t>
       </w:r>
@@ -2649,6 +2864,7 @@
         <w:rPr>
           <w:rFonts w:ascii="Segoe UI" w:hAnsi="Segoe UI" w:cs="Segoe UI"/>
           <w:color w:val="0F1115"/>
+          <w:lang w:val="en-US"/>
         </w:rPr>
         <w:br/>
       </w:r>
@@ -2659,6 +2875,7 @@
           <w:sz w:val="29"/>
           <w:szCs w:val="29"/>
           <w:bdr w:val="none" w:sz="0" w:space="0" w:color="auto" w:frame="1"/>
+          <w:lang w:val="en-US"/>
         </w:rPr>
         <w:t>KAE=Ae1mod  p</w:t>
       </w:r>
@@ -2671,6 +2888,7 @@
           <w:color w:val="0F1115"/>
           <w:sz w:val="29"/>
           <w:szCs w:val="29"/>
+          <w:lang w:val="en-US"/>
         </w:rPr>
         <w:t>K</w:t>
       </w:r>
@@ -2683,6 +2901,7 @@
           <w:color w:val="0F1115"/>
           <w:sz w:val="20"/>
           <w:szCs w:val="20"/>
+          <w:lang w:val="en-US"/>
         </w:rPr>
         <w:t>AE</w:t>
       </w:r>
@@ -2692,6 +2911,7 @@
           <w:color w:val="0F1115"/>
           <w:sz w:val="2"/>
           <w:szCs w:val="2"/>
+          <w:lang w:val="en-US"/>
         </w:rPr>
         <w:t>​</w:t>
       </w:r>
@@ -2701,6 +2921,7 @@
           <w:color w:val="0F1115"/>
           <w:sz w:val="29"/>
           <w:szCs w:val="29"/>
+          <w:lang w:val="en-US"/>
         </w:rPr>
         <w:t>=</w:t>
       </w:r>
@@ -2713,6 +2934,7 @@
           <w:color w:val="0F1115"/>
           <w:sz w:val="29"/>
           <w:szCs w:val="29"/>
+          <w:lang w:val="en-US"/>
         </w:rPr>
         <w:t>A</w:t>
       </w:r>
@@ -2725,6 +2947,7 @@
           <w:color w:val="0F1115"/>
           <w:sz w:val="20"/>
           <w:szCs w:val="20"/>
+          <w:lang w:val="en-US"/>
         </w:rPr>
         <w:t>e</w:t>
       </w:r>
@@ -2734,6 +2957,7 @@
           <w:color w:val="0F1115"/>
           <w:sz w:val="14"/>
           <w:szCs w:val="14"/>
+          <w:lang w:val="en-US"/>
         </w:rPr>
         <w:t>1</w:t>
       </w:r>
@@ -2743,6 +2967,7 @@
           <w:color w:val="0F1115"/>
           <w:sz w:val="2"/>
           <w:szCs w:val="2"/>
+          <w:lang w:val="en-US"/>
         </w:rPr>
         <w:t>​</w:t>
       </w:r>
@@ -2752,6 +2977,7 @@
           <w:color w:val="0F1115"/>
           <w:sz w:val="29"/>
           <w:szCs w:val="29"/>
+          <w:lang w:val="en-US"/>
         </w:rPr>
         <w:t>mod</w:t>
       </w:r>
@@ -2764,6 +2990,7 @@
           <w:color w:val="0F1115"/>
           <w:sz w:val="29"/>
           <w:szCs w:val="29"/>
+          <w:lang w:val="en-US"/>
         </w:rPr>
         <w:t>p</w:t>
       </w:r>
@@ -2771,6 +2998,7 @@
         <w:rPr>
           <w:rFonts w:ascii="Segoe UI" w:hAnsi="Segoe UI" w:cs="Segoe UI"/>
           <w:color w:val="0F1115"/>
+          <w:lang w:val="en-US"/>
         </w:rPr>
         <w:br/>
       </w:r>
@@ -2781,6 +3009,7 @@
           <w:sz w:val="29"/>
           <w:szCs w:val="29"/>
           <w:bdr w:val="none" w:sz="0" w:space="0" w:color="auto" w:frame="1"/>
+          <w:lang w:val="en-US"/>
         </w:rPr>
         <w:t>KAE=6620mod  991=592</w:t>
       </w:r>
@@ -2793,6 +3022,7 @@
           <w:color w:val="0F1115"/>
           <w:sz w:val="29"/>
           <w:szCs w:val="29"/>
+          <w:lang w:val="en-US"/>
         </w:rPr>
         <w:t>K</w:t>
       </w:r>
@@ -2805,6 +3035,7 @@
           <w:color w:val="0F1115"/>
           <w:sz w:val="20"/>
           <w:szCs w:val="20"/>
+          <w:lang w:val="en-US"/>
         </w:rPr>
         <w:t>AE</w:t>
       </w:r>
@@ -2814,6 +3045,7 @@
           <w:color w:val="0F1115"/>
           <w:sz w:val="2"/>
           <w:szCs w:val="2"/>
+          <w:lang w:val="en-US"/>
         </w:rPr>
         <w:t>​</w:t>
       </w:r>
@@ -2823,6 +3055,7 @@
           <w:color w:val="0F1115"/>
           <w:sz w:val="29"/>
           <w:szCs w:val="29"/>
+          <w:lang w:val="en-US"/>
         </w:rPr>
         <w:t>=</w:t>
       </w:r>
@@ -2832,6 +3065,7 @@
           <w:color w:val="0F1115"/>
           <w:sz w:val="29"/>
           <w:szCs w:val="29"/>
+          <w:lang w:val="en-US"/>
         </w:rPr>
         <w:t>66</w:t>
       </w:r>
@@ -2841,6 +3075,7 @@
           <w:color w:val="0F1115"/>
           <w:sz w:val="20"/>
           <w:szCs w:val="20"/>
+          <w:lang w:val="en-US"/>
         </w:rPr>
         <w:t>20</w:t>
       </w:r>
@@ -2850,6 +3085,7 @@
           <w:color w:val="0F1115"/>
           <w:sz w:val="29"/>
           <w:szCs w:val="29"/>
+          <w:lang w:val="en-US"/>
         </w:rPr>
         <w:t>mod991</w:t>
       </w:r>
@@ -2859,6 +3095,7 @@
           <w:color w:val="0F1115"/>
           <w:sz w:val="29"/>
           <w:szCs w:val="29"/>
+          <w:lang w:val="en-US"/>
         </w:rPr>
         <w:t>=</w:t>
       </w:r>
@@ -2868,6 +3105,7 @@
           <w:color w:val="0F1115"/>
           <w:sz w:val="29"/>
           <w:szCs w:val="29"/>
+          <w:lang w:val="en-US"/>
         </w:rPr>
         <w:t>592</w:t>
       </w:r>
@@ -2880,6 +3118,7 @@
         <w:rPr>
           <w:rFonts w:ascii="Segoe UI" w:hAnsi="Segoe UI" w:cs="Segoe UI"/>
           <w:color w:val="0F1115"/>
+          <w:lang w:val="en-US"/>
         </w:rPr>
       </w:pPr>
       <w:r>
@@ -2887,6 +3126,7 @@
           <w:rStyle w:val="a4"/>
           <w:rFonts w:ascii="Segoe UI" w:eastAsiaTheme="majorEastAsia" w:hAnsi="Segoe UI" w:cs="Segoe UI"/>
           <w:color w:val="0F1115"/>
+          <w:lang w:val="en-US"/>
         </w:rPr>
         <w:t>Eva ↔ Bob kaliti</w:t>
       </w:r>
@@ -2894,6 +3134,7 @@
         <w:rPr>
           <w:rFonts w:ascii="Segoe UI" w:hAnsi="Segoe UI" w:cs="Segoe UI"/>
           <w:color w:val="0F1115"/>
+          <w:lang w:val="en-US"/>
         </w:rPr>
         <w:t>:</w:t>
       </w:r>
@@ -2906,6 +3147,7 @@
         <w:rPr>
           <w:rFonts w:ascii="Segoe UI" w:hAnsi="Segoe UI" w:cs="Segoe UI"/>
           <w:color w:val="0F1115"/>
+          <w:lang w:val="en-US"/>
         </w:rPr>
       </w:pPr>
       <w:r>
@@ -2913,6 +3155,7 @@
           <w:rStyle w:val="a4"/>
           <w:rFonts w:ascii="Segoe UI" w:eastAsiaTheme="majorEastAsia" w:hAnsi="Segoe UI" w:cs="Segoe UI"/>
           <w:color w:val="0F1115"/>
+          <w:lang w:val="en-US"/>
         </w:rPr>
         <w:t>Bob tomondan</w:t>
       </w:r>
@@ -2920,6 +3163,7 @@
         <w:rPr>
           <w:rFonts w:ascii="Segoe UI" w:hAnsi="Segoe UI" w:cs="Segoe UI"/>
           <w:color w:val="0F1115"/>
+          <w:lang w:val="en-US"/>
         </w:rPr>
         <w:t>:</w:t>
       </w:r>
@@ -2927,6 +3171,7 @@
         <w:rPr>
           <w:rFonts w:ascii="Segoe UI" w:hAnsi="Segoe UI" w:cs="Segoe UI"/>
           <w:color w:val="0F1115"/>
+          <w:lang w:val="en-US"/>
         </w:rPr>
         <w:br/>
       </w:r>
@@ -2937,6 +3182,7 @@
           <w:sz w:val="29"/>
           <w:szCs w:val="29"/>
           <w:bdr w:val="none" w:sz="0" w:space="0" w:color="auto" w:frame="1"/>
+          <w:lang w:val="en-US"/>
         </w:rPr>
         <w:t>KEB=E2bmod  p</w:t>
       </w:r>
@@ -2949,6 +3195,7 @@
           <w:color w:val="0F1115"/>
           <w:sz w:val="29"/>
           <w:szCs w:val="29"/>
+          <w:lang w:val="en-US"/>
         </w:rPr>
         <w:t>K</w:t>
       </w:r>
@@ -2961,6 +3208,7 @@
           <w:color w:val="0F1115"/>
           <w:sz w:val="20"/>
           <w:szCs w:val="20"/>
+          <w:lang w:val="en-US"/>
         </w:rPr>
         <w:t>EB</w:t>
       </w:r>
@@ -2970,6 +3218,7 @@
           <w:color w:val="0F1115"/>
           <w:sz w:val="2"/>
           <w:szCs w:val="2"/>
+          <w:lang w:val="en-US"/>
         </w:rPr>
         <w:t>​</w:t>
       </w:r>
@@ -2979,6 +3228,7 @@
           <w:color w:val="0F1115"/>
           <w:sz w:val="29"/>
           <w:szCs w:val="29"/>
+          <w:lang w:val="en-US"/>
         </w:rPr>
         <w:t>=</w:t>
       </w:r>
@@ -2991,6 +3241,7 @@
           <w:color w:val="0F1115"/>
           <w:sz w:val="29"/>
           <w:szCs w:val="29"/>
+          <w:lang w:val="en-US"/>
         </w:rPr>
         <w:t>E</w:t>
       </w:r>
@@ -3000,6 +3251,7 @@
           <w:color w:val="0F1115"/>
           <w:sz w:val="20"/>
           <w:szCs w:val="20"/>
+          <w:lang w:val="en-US"/>
         </w:rPr>
         <w:t>2</w:t>
       </w:r>
@@ -3012,6 +3264,7 @@
           <w:color w:val="0F1115"/>
           <w:sz w:val="20"/>
           <w:szCs w:val="20"/>
+          <w:lang w:val="en-US"/>
         </w:rPr>
         <w:t>b</w:t>
       </w:r>
@@ -3021,6 +3274,7 @@
           <w:color w:val="0F1115"/>
           <w:sz w:val="2"/>
           <w:szCs w:val="2"/>
+          <w:lang w:val="en-US"/>
         </w:rPr>
         <w:t>​</w:t>
       </w:r>
@@ -3030,6 +3284,7 @@
           <w:color w:val="0F1115"/>
           <w:sz w:val="29"/>
           <w:szCs w:val="29"/>
+          <w:lang w:val="en-US"/>
         </w:rPr>
         <w:t>mod</w:t>
       </w:r>
@@ -3042,6 +3297,7 @@
           <w:color w:val="0F1115"/>
           <w:sz w:val="29"/>
           <w:szCs w:val="29"/>
+          <w:lang w:val="en-US"/>
         </w:rPr>
         <w:t>p</w:t>
       </w:r>
@@ -3049,6 +3305,7 @@
         <w:rPr>
           <w:rFonts w:ascii="Segoe UI" w:hAnsi="Segoe UI" w:cs="Segoe UI"/>
           <w:color w:val="0F1115"/>
+          <w:lang w:val="en-US"/>
         </w:rPr>
         <w:br/>
       </w:r>
@@ -3059,6 +3316,7 @@
           <w:sz w:val="29"/>
           <w:szCs w:val="29"/>
           <w:bdr w:val="none" w:sz="0" w:space="0" w:color="auto" w:frame="1"/>
+          <w:lang w:val="en-US"/>
         </w:rPr>
         <w:t>KEB=46073mod  991=235</w:t>
       </w:r>
@@ -3071,6 +3329,7 @@
           <w:color w:val="0F1115"/>
           <w:sz w:val="29"/>
           <w:szCs w:val="29"/>
+          <w:lang w:val="en-US"/>
         </w:rPr>
         <w:t>K</w:t>
       </w:r>
@@ -3083,6 +3342,7 @@
           <w:color w:val="0F1115"/>
           <w:sz w:val="20"/>
           <w:szCs w:val="20"/>
+          <w:lang w:val="en-US"/>
         </w:rPr>
         <w:t>EB</w:t>
       </w:r>
@@ -3092,6 +3352,7 @@
           <w:color w:val="0F1115"/>
           <w:sz w:val="2"/>
           <w:szCs w:val="2"/>
+          <w:lang w:val="en-US"/>
         </w:rPr>
         <w:t>​</w:t>
       </w:r>
@@ -3101,6 +3362,7 @@
           <w:color w:val="0F1115"/>
           <w:sz w:val="29"/>
           <w:szCs w:val="29"/>
+          <w:lang w:val="en-US"/>
         </w:rPr>
         <w:t>=</w:t>
       </w:r>
@@ -3110,6 +3372,7 @@
           <w:color w:val="0F1115"/>
           <w:sz w:val="29"/>
           <w:szCs w:val="29"/>
+          <w:lang w:val="en-US"/>
         </w:rPr>
         <w:t>460</w:t>
       </w:r>
@@ -3119,6 +3382,7 @@
           <w:color w:val="0F1115"/>
           <w:sz w:val="20"/>
           <w:szCs w:val="20"/>
+          <w:lang w:val="en-US"/>
         </w:rPr>
         <w:t>73</w:t>
       </w:r>
@@ -3128,6 +3392,7 @@
           <w:color w:val="0F1115"/>
           <w:sz w:val="29"/>
           <w:szCs w:val="29"/>
+          <w:lang w:val="en-US"/>
         </w:rPr>
         <w:t>mod991</w:t>
       </w:r>
@@ -3137,6 +3402,7 @@
           <w:color w:val="0F1115"/>
           <w:sz w:val="29"/>
           <w:szCs w:val="29"/>
+          <w:lang w:val="en-US"/>
         </w:rPr>
         <w:t>=</w:t>
       </w:r>
@@ -3146,6 +3412,7 @@
           <w:color w:val="0F1115"/>
           <w:sz w:val="29"/>
           <w:szCs w:val="29"/>
+          <w:lang w:val="en-US"/>
         </w:rPr>
         <w:t>235</w:t>
       </w:r>
@@ -3158,6 +3425,7 @@
         <w:rPr>
           <w:rFonts w:ascii="Segoe UI" w:hAnsi="Segoe UI" w:cs="Segoe UI"/>
           <w:color w:val="0F1115"/>
+          <w:lang w:val="en-US"/>
         </w:rPr>
       </w:pPr>
       <w:r>
@@ -3165,6 +3433,7 @@
           <w:rStyle w:val="a4"/>
           <w:rFonts w:ascii="Segoe UI" w:eastAsiaTheme="majorEastAsia" w:hAnsi="Segoe UI" w:cs="Segoe UI"/>
           <w:color w:val="0F1115"/>
+          <w:lang w:val="en-US"/>
         </w:rPr>
         <w:t>Eva tomondan</w:t>
       </w:r>
@@ -3172,6 +3441,7 @@
         <w:rPr>
           <w:rFonts w:ascii="Segoe UI" w:hAnsi="Segoe UI" w:cs="Segoe UI"/>
           <w:color w:val="0F1115"/>
+          <w:lang w:val="en-US"/>
         </w:rPr>
         <w:t>:</w:t>
       </w:r>
@@ -3179,6 +3449,7 @@
         <w:rPr>
           <w:rFonts w:ascii="Segoe UI" w:hAnsi="Segoe UI" w:cs="Segoe UI"/>
           <w:color w:val="0F1115"/>
+          <w:lang w:val="en-US"/>
         </w:rPr>
         <w:br/>
       </w:r>
@@ -3189,6 +3460,7 @@
           <w:sz w:val="29"/>
           <w:szCs w:val="29"/>
           <w:bdr w:val="none" w:sz="0" w:space="0" w:color="auto" w:frame="1"/>
+          <w:lang w:val="en-US"/>
         </w:rPr>
         <w:t>KEB=Be2mod  p</w:t>
       </w:r>
@@ -3201,6 +3473,7 @@
           <w:color w:val="0F1115"/>
           <w:sz w:val="29"/>
           <w:szCs w:val="29"/>
+          <w:lang w:val="en-US"/>
         </w:rPr>
         <w:t>K</w:t>
       </w:r>
@@ -3213,6 +3486,7 @@
           <w:color w:val="0F1115"/>
           <w:sz w:val="20"/>
           <w:szCs w:val="20"/>
+          <w:lang w:val="en-US"/>
         </w:rPr>
         <w:t>EB</w:t>
       </w:r>
@@ -3222,6 +3496,7 @@
           <w:color w:val="0F1115"/>
           <w:sz w:val="2"/>
           <w:szCs w:val="2"/>
+          <w:lang w:val="en-US"/>
         </w:rPr>
         <w:t>​</w:t>
       </w:r>
@@ -3231,6 +3506,7 @@
           <w:color w:val="0F1115"/>
           <w:sz w:val="29"/>
           <w:szCs w:val="29"/>
+          <w:lang w:val="en-US"/>
         </w:rPr>
         <w:t>=</w:t>
       </w:r>
@@ -3243,6 +3519,7 @@
           <w:color w:val="0F1115"/>
           <w:sz w:val="29"/>
           <w:szCs w:val="29"/>
+          <w:lang w:val="en-US"/>
         </w:rPr>
         <w:t>B</w:t>
       </w:r>
@@ -3255,6 +3532,7 @@
           <w:color w:val="0F1115"/>
           <w:sz w:val="20"/>
           <w:szCs w:val="20"/>
+          <w:lang w:val="en-US"/>
         </w:rPr>
         <w:t>e</w:t>
       </w:r>
@@ -3264,6 +3542,7 @@
           <w:color w:val="0F1115"/>
           <w:sz w:val="14"/>
           <w:szCs w:val="14"/>
+          <w:lang w:val="en-US"/>
         </w:rPr>
         <w:t>2</w:t>
       </w:r>
@@ -3273,6 +3552,7 @@
           <w:color w:val="0F1115"/>
           <w:sz w:val="2"/>
           <w:szCs w:val="2"/>
+          <w:lang w:val="en-US"/>
         </w:rPr>
         <w:t>​</w:t>
       </w:r>
@@ -3282,6 +3562,7 @@
           <w:color w:val="0F1115"/>
           <w:sz w:val="29"/>
           <w:szCs w:val="29"/>
+          <w:lang w:val="en-US"/>
         </w:rPr>
         <w:t>mod</w:t>
       </w:r>
@@ -3294,6 +3575,7 @@
           <w:color w:val="0F1115"/>
           <w:sz w:val="29"/>
           <w:szCs w:val="29"/>
+          <w:lang w:val="en-US"/>
         </w:rPr>
         <w:t>p</w:t>
       </w:r>
@@ -3301,6 +3583,7 @@
         <w:rPr>
           <w:rFonts w:ascii="Segoe UI" w:hAnsi="Segoe UI" w:cs="Segoe UI"/>
           <w:color w:val="0F1115"/>
+          <w:lang w:val="en-US"/>
         </w:rPr>
         <w:br/>
       </w:r>
@@ -3311,6 +3594,7 @@
           <w:sz w:val="29"/>
           <w:szCs w:val="29"/>
           <w:bdr w:val="none" w:sz="0" w:space="0" w:color="auto" w:frame="1"/>
+          <w:lang w:val="en-US"/>
         </w:rPr>
         <w:t>KEB=55845mod  991=235</w:t>
       </w:r>
@@ -3323,6 +3607,7 @@
           <w:color w:val="0F1115"/>
           <w:sz w:val="29"/>
           <w:szCs w:val="29"/>
+          <w:lang w:val="en-US"/>
         </w:rPr>
         <w:t>K</w:t>
       </w:r>
@@ -3335,6 +3620,7 @@
           <w:color w:val="0F1115"/>
           <w:sz w:val="20"/>
           <w:szCs w:val="20"/>
+          <w:lang w:val="en-US"/>
         </w:rPr>
         <w:t>EB</w:t>
       </w:r>
@@ -3344,6 +3630,7 @@
           <w:color w:val="0F1115"/>
           <w:sz w:val="2"/>
           <w:szCs w:val="2"/>
+          <w:lang w:val="en-US"/>
         </w:rPr>
         <w:t>​</w:t>
       </w:r>
@@ -3353,6 +3640,7 @@
           <w:color w:val="0F1115"/>
           <w:sz w:val="29"/>
           <w:szCs w:val="29"/>
+          <w:lang w:val="en-US"/>
         </w:rPr>
         <w:t>=</w:t>
       </w:r>
@@ -3362,6 +3650,7 @@
           <w:color w:val="0F1115"/>
           <w:sz w:val="29"/>
           <w:szCs w:val="29"/>
+          <w:lang w:val="en-US"/>
         </w:rPr>
         <w:t>558</w:t>
       </w:r>
@@ -3371,6 +3660,7 @@
           <w:color w:val="0F1115"/>
           <w:sz w:val="20"/>
           <w:szCs w:val="20"/>
+          <w:lang w:val="en-US"/>
         </w:rPr>
         <w:t>45</w:t>
       </w:r>
@@ -3380,6 +3670,7 @@
           <w:color w:val="0F1115"/>
           <w:sz w:val="29"/>
           <w:szCs w:val="29"/>
+          <w:lang w:val="en-US"/>
         </w:rPr>
         <w:t>mod991</w:t>
       </w:r>
@@ -3389,6 +3680,7 @@
           <w:color w:val="0F1115"/>
           <w:sz w:val="29"/>
           <w:szCs w:val="29"/>
+          <w:lang w:val="en-US"/>
         </w:rPr>
         <w:t>=</w:t>
       </w:r>
@@ -3398,6 +3690,7 @@
           <w:color w:val="0F1115"/>
           <w:sz w:val="29"/>
           <w:szCs w:val="29"/>
+          <w:lang w:val="en-US"/>
         </w:rPr>
         <w:t>235</w:t>
       </w:r>
@@ -3437,9 +3730,9 @@
         <w:tblLook w:val="04A0" w:firstRow="1" w:lastRow="0" w:firstColumn="1" w:lastColumn="0" w:noHBand="0" w:noVBand="1"/>
       </w:tblPr>
       <w:tblGrid>
-        <w:gridCol w:w="1474"/>
+        <w:gridCol w:w="1441"/>
         <w:gridCol w:w="2455"/>
-        <w:gridCol w:w="3171"/>
+        <w:gridCol w:w="3057"/>
       </w:tblGrid>
       <w:tr>
         <w:trPr>
@@ -3971,12 +4264,14 @@
         <w:rPr>
           <w:rFonts w:ascii="Segoe UI" w:hAnsi="Segoe UI" w:cs="Segoe UI"/>
           <w:color w:val="0F1115"/>
-        </w:rPr>
-      </w:pPr>
-      <w:r>
-        <w:rPr>
-          <w:rFonts w:ascii="Segoe UI" w:hAnsi="Segoe UI" w:cs="Segoe UI"/>
-          <w:color w:val="0F1115"/>
+          <w:lang w:val="en-US"/>
+        </w:rPr>
+      </w:pPr>
+      <w:r>
+        <w:rPr>
+          <w:rFonts w:ascii="Segoe UI" w:hAnsi="Segoe UI" w:cs="Segoe UI"/>
+          <w:color w:val="0F1115"/>
+          <w:lang w:val="en-US"/>
         </w:rPr>
         <w:t>Eva ikkala tomonga nisbatan ikkita alohida Diffie-Hellman seansini yaratdi</w:t>
       </w:r>
@@ -3994,12 +4289,14 @@
         <w:rPr>
           <w:rFonts w:ascii="Segoe UI" w:hAnsi="Segoe UI" w:cs="Segoe UI"/>
           <w:color w:val="0F1115"/>
-        </w:rPr>
-      </w:pPr>
-      <w:r>
-        <w:rPr>
-          <w:rFonts w:ascii="Segoe UI" w:hAnsi="Segoe UI" w:cs="Segoe UI"/>
-          <w:color w:val="0F1115"/>
+          <w:lang w:val="en-US"/>
+        </w:rPr>
+      </w:pPr>
+      <w:r>
+        <w:rPr>
+          <w:rFonts w:ascii="Segoe UI" w:hAnsi="Segoe UI" w:cs="Segoe UI"/>
+          <w:color w:val="0F1115"/>
+          <w:lang w:val="en-US"/>
         </w:rPr>
         <w:t>Alisa </w:t>
       </w:r>
@@ -4010,6 +4307,7 @@
           <w:sz w:val="29"/>
           <w:szCs w:val="29"/>
           <w:bdr w:val="none" w:sz="0" w:space="0" w:color="auto" w:frame="1"/>
+          <w:lang w:val="en-US"/>
         </w:rPr>
         <w:t>KAE=592</w:t>
       </w:r>
@@ -4022,6 +4320,7 @@
           <w:color w:val="0F1115"/>
           <w:sz w:val="29"/>
           <w:szCs w:val="29"/>
+          <w:lang w:val="en-US"/>
         </w:rPr>
         <w:t>K</w:t>
       </w:r>
@@ -4034,6 +4333,7 @@
           <w:color w:val="0F1115"/>
           <w:sz w:val="20"/>
           <w:szCs w:val="20"/>
+          <w:lang w:val="en-US"/>
         </w:rPr>
         <w:t>AE</w:t>
       </w:r>
@@ -4043,6 +4343,7 @@
           <w:color w:val="0F1115"/>
           <w:sz w:val="2"/>
           <w:szCs w:val="2"/>
+          <w:lang w:val="en-US"/>
         </w:rPr>
         <w:t>​</w:t>
       </w:r>
@@ -4052,6 +4353,7 @@
           <w:color w:val="0F1115"/>
           <w:sz w:val="29"/>
           <w:szCs w:val="29"/>
+          <w:lang w:val="en-US"/>
         </w:rPr>
         <w:t>=</w:t>
       </w:r>
@@ -4061,6 +4363,7 @@
           <w:color w:val="0F1115"/>
           <w:sz w:val="29"/>
           <w:szCs w:val="29"/>
+          <w:lang w:val="en-US"/>
         </w:rPr>
         <w:t>592</w:t>
       </w:r>
@@ -4068,6 +4371,7 @@
         <w:rPr>
           <w:rFonts w:ascii="Segoe UI" w:hAnsi="Segoe UI" w:cs="Segoe UI"/>
           <w:color w:val="0F1115"/>
+          <w:lang w:val="en-US"/>
         </w:rPr>
         <w:t> kalit orqali Eva bilan "xavfsiz" aloqada deb o'ylaydi</w:t>
       </w:r>
@@ -4085,12 +4389,14 @@
         <w:rPr>
           <w:rFonts w:ascii="Segoe UI" w:hAnsi="Segoe UI" w:cs="Segoe UI"/>
           <w:color w:val="0F1115"/>
-        </w:rPr>
-      </w:pPr>
-      <w:r>
-        <w:rPr>
-          <w:rFonts w:ascii="Segoe UI" w:hAnsi="Segoe UI" w:cs="Segoe UI"/>
-          <w:color w:val="0F1115"/>
+          <w:lang w:val="en-US"/>
+        </w:rPr>
+      </w:pPr>
+      <w:r>
+        <w:rPr>
+          <w:rFonts w:ascii="Segoe UI" w:hAnsi="Segoe UI" w:cs="Segoe UI"/>
+          <w:color w:val="0F1115"/>
+          <w:lang w:val="en-US"/>
         </w:rPr>
         <w:t>Bob </w:t>
       </w:r>
@@ -4101,6 +4407,7 @@
           <w:sz w:val="29"/>
           <w:szCs w:val="29"/>
           <w:bdr w:val="none" w:sz="0" w:space="0" w:color="auto" w:frame="1"/>
+          <w:lang w:val="en-US"/>
         </w:rPr>
         <w:t>KEB=235</w:t>
       </w:r>
@@ -4113,6 +4420,7 @@
           <w:color w:val="0F1115"/>
           <w:sz w:val="29"/>
           <w:szCs w:val="29"/>
+          <w:lang w:val="en-US"/>
         </w:rPr>
         <w:t>K</w:t>
       </w:r>
@@ -4125,6 +4433,7 @@
           <w:color w:val="0F1115"/>
           <w:sz w:val="20"/>
           <w:szCs w:val="20"/>
+          <w:lang w:val="en-US"/>
         </w:rPr>
         <w:t>EB</w:t>
       </w:r>
@@ -4134,6 +4443,7 @@
           <w:color w:val="0F1115"/>
           <w:sz w:val="2"/>
           <w:szCs w:val="2"/>
+          <w:lang w:val="en-US"/>
         </w:rPr>
         <w:t>​</w:t>
       </w:r>
@@ -4143,6 +4453,7 @@
           <w:color w:val="0F1115"/>
           <w:sz w:val="29"/>
           <w:szCs w:val="29"/>
+          <w:lang w:val="en-US"/>
         </w:rPr>
         <w:t>=</w:t>
       </w:r>
@@ -4152,6 +4463,7 @@
           <w:color w:val="0F1115"/>
           <w:sz w:val="29"/>
           <w:szCs w:val="29"/>
+          <w:lang w:val="en-US"/>
         </w:rPr>
         <w:t>235</w:t>
       </w:r>
@@ -4159,6 +4471,7 @@
         <w:rPr>
           <w:rFonts w:ascii="Segoe UI" w:hAnsi="Segoe UI" w:cs="Segoe UI"/>
           <w:color w:val="0F1115"/>
+          <w:lang w:val="en-US"/>
         </w:rPr>
         <w:t> kalit orqali Eva bilan "xavfsiz" aloqada deb o'ylaydi</w:t>
       </w:r>
@@ -4176,17 +4489,134 @@
         <w:rPr>
           <w:rFonts w:ascii="Segoe UI" w:hAnsi="Segoe UI" w:cs="Segoe UI"/>
           <w:color w:val="0F1115"/>
-        </w:rPr>
-      </w:pPr>
-      <w:r>
-        <w:rPr>
-          <w:rFonts w:ascii="Segoe UI" w:hAnsi="Segoe UI" w:cs="Segoe UI"/>
-          <w:color w:val="0F1115"/>
+          <w:lang w:val="en-US"/>
+        </w:rPr>
+      </w:pPr>
+      <w:r>
+        <w:rPr>
+          <w:rFonts w:ascii="Segoe UI" w:hAnsi="Segoe UI" w:cs="Segoe UI"/>
+          <w:color w:val="0F1115"/>
+          <w:lang w:val="en-US"/>
         </w:rPr>
         <w:t>Eva har ikkala kalitni bilgani uchun ikkala tomondan keladigan xabarlarni o'qiydi va o'zgartira oladi</w:t>
       </w:r>
     </w:p>
     <w:p>
+      <w:pPr>
+        <w:rPr>
+          <w:lang w:val="en-US"/>
+        </w:rPr>
+      </w:pPr>
+      <w:r>
+        <w:rPr>
+          <w:lang w:val="en-US"/>
+        </w:rPr>
+        <w:br w:type="page"/>
+      </w:r>
+    </w:p>
+    <w:p>
+      <w:pPr>
+        <w:pStyle w:val="1"/>
+      </w:pPr>
+      <w:r>
+        <w:lastRenderedPageBreak/>
+        <w:t>Diffie–Hellman protokolida MITM hujumi</w:t>
+      </w:r>
+    </w:p>
+    <w:p>
+      <w:r>
+        <w:t>Diffie–Hellman protokolida Alisa va Bob umumiy maxfiy kalit o‘rnatishmoqchi, lekin Eva o‘rtada turgan shaxs (MITM) hujumini amalga oshiradi. Hujum jarayoni quyidagicha amalga oshadi:</w:t>
+      </w:r>
+    </w:p>
+    <w:p>
+      <w:r>
+        <w:t>1. Alisa va Bob umumiy parametrlarni kelishiradi: p = 991 va g = 173.</w:t>
+      </w:r>
+    </w:p>
+    <w:p>
+      <w:r>
+        <w:t>2. Alisa o‘zining maxfiy kalitini a = 39 deb tanlaydi va o‘zining ochiq kalitini hisoblaydi: A = g^a mod p = 173^39 mod 991 = 782.</w:t>
+      </w:r>
+    </w:p>
+    <w:p>
+      <w:r>
+        <w:t>3. Bob o‘zining maxfiy kalitini b = 73 deb tanlaydi va o‘zining ochiq kalitini hisoblaydi: B = g^b mod p = 173^73 mod 991 = 329.</w:t>
+      </w:r>
+    </w:p>
+    <w:p>
+      <w:r>
+        <w:t>4. Eva o‘zining maxfiy kalitini e = 10 deb tanlaydi (bu ixtiyoriy tanlangan qiymat) va o‘zining ochiq kalitini hisoblaydi: E = g^e mod p = 173^10 mod 991 = 424.</w:t>
+      </w:r>
+    </w:p>
+    <w:p>
+      <w:r>
+        <w:t>5. Alisa o‘z ochiq kaliti A ni Bobga yubormoqchi bo‘ladi, lekin Eva uni intercept qilib oladi va Bobga E ni yuboradi.</w:t>
+      </w:r>
+    </w:p>
+    <w:p>
+      <w:r>
+        <w:t>6. Xuddi shu tarzda, Bob o‘z ochiq kaliti B ni Alisaga yubormoqchi bo‘ladi, lekin Eva uni intercept qilib oladi va Alisaga E ni yuboradi.</w:t>
+      </w:r>
+    </w:p>
+    <w:p>
+      <w:r>
+        <w:t>7. Alisa, E ni Bobning ochiq kaliti deb hisoblab, umumiy maxfiy kalitni hisoblaydi: K_AE = E^a mod p = 424^39 mod 991. Eva bilan umumiy kalitni esa Eva A^e mod p orqali ham hisoblashi mumkin: K_AE = A^e mod p = 782^10 mod 991 = 451.</w:t>
+      </w:r>
+    </w:p>
+    <w:p>
+      <w:r>
+        <w:t>8. Bob, E ni Alisaning ochiq kaliti deb hisoblab, umumiy maxfiy kalitni hisoblaydi: K_BE = E^b mod p = 424^73 mod 991. Eva bilan umumiy kalitni esa Eva B^e mod p orqali ham hisoblashi mumkin: K_BE = B^e mod p = 329^10 mod 991 = 482.</w:t>
+      </w:r>
+    </w:p>
+    <w:p>
+      <w:pPr>
+        <w:pStyle w:val="2"/>
+      </w:pPr>
+      <w:r>
+        <w:t>Natija:</w:t>
+      </w:r>
+    </w:p>
+    <w:p>
+      <w:r>
+        <w:t>• Alisa va Eva o‘rtasida umumiy maxfiy kalit K_AE = 451 hisoblanadi.</w:t>
+      </w:r>
+    </w:p>
+    <w:p>
+      <w:r>
+        <w:t>• Bob va Eva o‘rtasida umumiy maxfiy kalit K_BE = 482 hisoblanadi.</w:t>
+      </w:r>
+    </w:p>
+    <w:p>
+      <w:r>
+        <w:t>Eva endi Alisadan kelgan har qanday xabarni K_AE yordamida dekod qilishi, keyin K_BE yordamida Bobga kodlashi mumkin va aksincha. Shuning uchun Alisa va Bob bir-birlari bilan to‘g‘ridan-to‘g‘ri aloqa qilayotgan deb hisoblasalar-da, aslida Eva orqali aloqa qilishmoqda va Eva ularning barcha xabarlarini o‘qishi mumkin.</w:t>
+      </w:r>
+    </w:p>
+    <w:p>
+      <w:pPr>
+        <w:pStyle w:val="2"/>
+      </w:pPr>
+      <w:r>
+        <w:t>Namuna:</w:t>
+      </w:r>
+    </w:p>
+    <w:p>
+      <w:pPr>
+        <w:pStyle w:val="a5"/>
+      </w:pPr>
+      <w:r>
+        <w:t>• Alisa–Eva umumiy kaliti: 451</w:t>
+      </w:r>
+      <w:r>
+        <w:br/>
+        <w:t>• Bob–Eva umumiy kaliti: 482</w:t>
+      </w:r>
+    </w:p>
+    <w:p>
+      <w:pPr>
+        <w:rPr>
+          <w:lang w:val="en-US"/>
+        </w:rPr>
+      </w:pPr>
       <w:bookmarkStart w:id="0" w:name="_GoBack"/>
       <w:bookmarkEnd w:id="0"/>
     </w:p>
@@ -4201,7 +4631,7 @@
 </file>
 
 <file path=word/numbering.xml><?xml version="1.0" encoding="utf-8"?>
-<w:numbering xmlns:wpc="http://schemas.microsoft.com/office/word/2010/wordprocessingCanvas" xmlns:cx="http://schemas.microsoft.com/office/drawing/2014/chartex" xmlns:cx1="http://schemas.microsoft.com/office/drawing/2015/9/8/chartex" xmlns:cx2="http://schemas.microsoft.com/office/drawing/2015/10/21/chartex" xmlns:cx3="http://schemas.microsoft.com/office/drawing/2016/5/9/chartex" xmlns:cx4="http://schemas.microsoft.com/office/drawing/2016/5/10/chartex" xmlns:cx5="http://schemas.microsoft.com/office/drawing/2016/5/11/chartex" xmlns:cx6="http://schemas.microsoft.com/office/drawing/2016/5/12/chartex" xmlns:cx7="http://schemas.microsoft.com/office/drawing/2016/5/13/chartex" xmlns:cx8="http://schemas.microsoft.com/office/drawing/2016/5/14/chartex" xmlns:mc="http://schemas.openxmlformats.org/markup-compatibility/2006" xmlns:aink="http://schemas.microsoft.com/office/drawing/2016/ink" xmlns:am3d="http://schemas.microsoft.com/office/drawing/2017/model3d" xmlns:o="urn:schemas-microsoft-com:office:office" xmlns:r="http://schemas.openxmlformats.org/officeDocument/2006/relationships" xmlns:m="http://schemas.openxmlformats.org/officeDocument/2006/math" xmlns:v="urn:schemas-microsoft-com:vml" xmlns:wp14="http://schemas.microsoft.com/office/word/2010/wordprocessingDrawing" xmlns:wp="http://schemas.openxmlformats.org/drawingml/2006/wordprocessingDrawing" xmlns:w10="urn:schemas-microsoft-com:office:word" xmlns:w="http://schemas.openxmlformats.org/wordprocessingml/2006/main" xmlns:w14="http://schemas.microsoft.com/office/word/2010/wordml" xmlns:w15="http://schemas.microsoft.com/office/word/2012/wordml" xmlns:w16cex="http://schemas.microsoft.com/office/word/2018/wordml/cex" xmlns:w16cid="http://schemas.microsoft.com/office/word/2016/wordml/cid" xmlns:w16="http://schemas.microsoft.com/office/word/2018/wordml" xmlns:w16se="http://schemas.microsoft.com/office/word/2015/wordml/symex" xmlns:wpg="http://schemas.microsoft.com/office/word/2010/wordprocessingGroup" xmlns:wpi="http://schemas.microsoft.com/office/word/2010/wordprocessingInk" xmlns:wne="http://schemas.microsoft.com/office/word/2006/wordml" xmlns:wps="http://schemas.microsoft.com/office/word/2010/wordprocessingShape" mc:Ignorable="w14 w15 w16se w16cid w16 w16cex wp14">
+<w:numbering xmlns:wpc="http://schemas.microsoft.com/office/word/2010/wordprocessingCanvas" xmlns:cx="http://schemas.microsoft.com/office/drawing/2014/chartex" xmlns:cx1="http://schemas.microsoft.com/office/drawing/2015/9/8/chartex" xmlns:cx2="http://schemas.microsoft.com/office/drawing/2015/10/21/chartex" xmlns:cx3="http://schemas.microsoft.com/office/drawing/2016/5/9/chartex" xmlns:cx4="http://schemas.microsoft.com/office/drawing/2016/5/10/chartex" xmlns:cx5="http://schemas.microsoft.com/office/drawing/2016/5/11/chartex" xmlns:cx6="http://schemas.microsoft.com/office/drawing/2016/5/12/chartex" xmlns:cx7="http://schemas.microsoft.com/office/drawing/2016/5/13/chartex" xmlns:cx8="http://schemas.microsoft.com/office/drawing/2016/5/14/chartex" xmlns:mc="http://schemas.openxmlformats.org/markup-compatibility/2006" xmlns:aink="http://schemas.microsoft.com/office/drawing/2016/ink" xmlns:am3d="http://schemas.microsoft.com/office/drawing/2017/model3d" xmlns:o="urn:schemas-microsoft-com:office:office" xmlns:r="http://schemas.openxmlformats.org/officeDocument/2006/relationships" xmlns:m="http://schemas.openxmlformats.org/officeDocument/2006/math" xmlns:v="urn:schemas-microsoft-com:vml" xmlns:wp14="http://schemas.microsoft.com/office/word/2010/wordprocessingDrawing" xmlns:wp="http://schemas.openxmlformats.org/drawingml/2006/wordprocessingDrawing" xmlns:w10="urn:schemas-microsoft-com:office:word" xmlns:w="http://schemas.openxmlformats.org/wordprocessingml/2006/main" xmlns:w14="http://schemas.microsoft.com/office/word/2010/wordml" xmlns:w15="http://schemas.microsoft.com/office/word/2012/wordml" xmlns:w16cid="http://schemas.microsoft.com/office/word/2016/wordml/cid" xmlns:w16se="http://schemas.microsoft.com/office/word/2015/wordml/symex" xmlns:wpg="http://schemas.microsoft.com/office/word/2010/wordprocessingGroup" xmlns:wpi="http://schemas.microsoft.com/office/word/2010/wordprocessingInk" xmlns:wne="http://schemas.microsoft.com/office/word/2006/wordml" xmlns:wps="http://schemas.microsoft.com/office/word/2010/wordprocessingShape" mc:Ignorable="w14 w15 w16se w16cid wp14">
   <w:abstractNum w:abstractNumId="0" w15:restartNumberingAfterBreak="0">
     <w:nsid w:val="117D2CAB"/>
     <w:multiLevelType w:val="multilevel"/>
@@ -6322,14 +6752,14 @@
 </file>
 
 <file path=word/styles.xml><?xml version="1.0" encoding="utf-8"?>
-<w:styles xmlns:mc="http://schemas.openxmlformats.org/markup-compatibility/2006" xmlns:r="http://schemas.openxmlformats.org/officeDocument/2006/relationships" xmlns:w="http://schemas.openxmlformats.org/wordprocessingml/2006/main" xmlns:w14="http://schemas.microsoft.com/office/word/2010/wordml" xmlns:w15="http://schemas.microsoft.com/office/word/2012/wordml" xmlns:w16cex="http://schemas.microsoft.com/office/word/2018/wordml/cex" xmlns:w16cid="http://schemas.microsoft.com/office/word/2016/wordml/cid" xmlns:w16="http://schemas.microsoft.com/office/word/2018/wordml" xmlns:w16se="http://schemas.microsoft.com/office/word/2015/wordml/symex" mc:Ignorable="w14 w15 w16se w16cid w16 w16cex">
+<w:styles xmlns:mc="http://schemas.openxmlformats.org/markup-compatibility/2006" xmlns:r="http://schemas.openxmlformats.org/officeDocument/2006/relationships" xmlns:w="http://schemas.openxmlformats.org/wordprocessingml/2006/main" xmlns:w14="http://schemas.microsoft.com/office/word/2010/wordml" xmlns:w15="http://schemas.microsoft.com/office/word/2012/wordml" xmlns:w16cid="http://schemas.microsoft.com/office/word/2016/wordml/cid" xmlns:w16se="http://schemas.microsoft.com/office/word/2015/wordml/symex" mc:Ignorable="w14 w15 w16se w16cid">
   <w:docDefaults>
     <w:rPrDefault>
       <w:rPr>
         <w:rFonts w:asciiTheme="minorHAnsi" w:eastAsiaTheme="minorHAnsi" w:hAnsiTheme="minorHAnsi" w:cstheme="minorBidi"/>
         <w:sz w:val="22"/>
         <w:szCs w:val="22"/>
-        <w:lang w:eastAsia="en-US" w:bidi="ar-SA"/>
+        <w:lang w:val="ru-RU" w:eastAsia="en-US" w:bidi="ar-SA"/>
       </w:rPr>
     </w:rPrDefault>
     <w:pPrDefault>
@@ -6338,7 +6768,7 @@
       </w:pPr>
     </w:pPrDefault>
   </w:docDefaults>
-  <w:latentStyles w:defLockedState="0" w:defUIPriority="99" w:defSemiHidden="0" w:defUnhideWhenUsed="0" w:defQFormat="0" w:count="376">
+  <w:latentStyles w:defLockedState="0" w:defUIPriority="99" w:defSemiHidden="0" w:defUnhideWhenUsed="0" w:defQFormat="0" w:count="377">
     <w:lsdException w:name="Normal" w:uiPriority="0" w:qFormat="1"/>
     <w:lsdException w:name="heading 1" w:uiPriority="9" w:qFormat="1"/>
     <w:lsdException w:name="heading 2" w:semiHidden="1" w:uiPriority="9" w:unhideWhenUsed="1" w:qFormat="1"/>
@@ -6444,7 +6874,6 @@
     <w:lsdException w:name="HTML Sample" w:semiHidden="1" w:unhideWhenUsed="1"/>
     <w:lsdException w:name="HTML Typewriter" w:semiHidden="1" w:unhideWhenUsed="1"/>
     <w:lsdException w:name="HTML Variable" w:semiHidden="1" w:unhideWhenUsed="1"/>
-    <w:lsdException w:name="Normal Table" w:semiHidden="1" w:unhideWhenUsed="1"/>
     <w:lsdException w:name="annotation subject" w:semiHidden="1" w:unhideWhenUsed="1"/>
     <w:lsdException w:name="No List" w:semiHidden="1" w:unhideWhenUsed="1"/>
     <w:lsdException w:name="Outline List 1" w:semiHidden="1" w:unhideWhenUsed="1"/>
@@ -6491,10 +6920,8 @@
     <w:lsdException w:name="Table Subtle 2" w:semiHidden="1" w:unhideWhenUsed="1"/>
     <w:lsdException w:name="Table Web 1" w:semiHidden="1" w:unhideWhenUsed="1"/>
     <w:lsdException w:name="Table Web 2" w:semiHidden="1" w:unhideWhenUsed="1"/>
-    <w:lsdException w:name="Table Web 3" w:semiHidden="1" w:unhideWhenUsed="1"/>
     <w:lsdException w:name="Balloon Text" w:semiHidden="1" w:unhideWhenUsed="1"/>
     <w:lsdException w:name="Table Grid" w:uiPriority="39"/>
-    <w:lsdException w:name="Table Theme" w:semiHidden="1" w:unhideWhenUsed="1"/>
     <w:lsdException w:name="Placeholder Text" w:semiHidden="1"/>
     <w:lsdException w:name="No Spacing" w:uiPriority="1" w:qFormat="1"/>
     <w:lsdException w:name="Light Shading" w:uiPriority="60"/>
@@ -6715,6 +7142,7 @@
     <w:lsdException w:name="Hashtag" w:semiHidden="1" w:unhideWhenUsed="1"/>
     <w:lsdException w:name="Unresolved Mention" w:semiHidden="1" w:unhideWhenUsed="1"/>
     <w:lsdException w:name="Smart Link" w:semiHidden="1" w:unhideWhenUsed="1"/>
+    <w:lsdException w:name="Smart Link Error" w:semiHidden="1" w:unhideWhenUsed="1"/>
   </w:latentStyles>
   <w:style w:type="paragraph" w:default="1" w:styleId="a">
     <w:name w:val="Normal"/>
@@ -6758,7 +7186,6 @@
       <w:bCs/>
       <w:sz w:val="36"/>
       <w:szCs w:val="36"/>
-      <w:lang/>
     </w:rPr>
   </w:style>
   <w:style w:type="paragraph" w:styleId="3">
@@ -6778,7 +7205,6 @@
       <w:bCs/>
       <w:sz w:val="27"/>
       <w:szCs w:val="27"/>
-      <w:lang/>
     </w:rPr>
   </w:style>
   <w:style w:type="character" w:default="1" w:styleId="a0">
@@ -6820,7 +7246,6 @@
       <w:bCs/>
       <w:sz w:val="36"/>
       <w:szCs w:val="36"/>
-      <w:lang/>
     </w:rPr>
   </w:style>
   <w:style w:type="character" w:customStyle="1" w:styleId="30">
@@ -6835,7 +7260,6 @@
       <w:bCs/>
       <w:sz w:val="27"/>
       <w:szCs w:val="27"/>
-      <w:lang/>
     </w:rPr>
   </w:style>
   <w:style w:type="paragraph" w:styleId="a3">
@@ -6852,7 +7276,6 @@
       <w:rFonts w:ascii="Times New Roman" w:eastAsia="Times New Roman" w:hAnsi="Times New Roman" w:cs="Times New Roman"/>
       <w:sz w:val="24"/>
       <w:szCs w:val="24"/>
-      <w:lang/>
     </w:rPr>
   </w:style>
   <w:style w:type="character" w:styleId="a4">
@@ -6890,7 +7313,6 @@
       <w:rFonts w:ascii="Times New Roman" w:eastAsia="Times New Roman" w:hAnsi="Times New Roman" w:cs="Times New Roman"/>
       <w:sz w:val="24"/>
       <w:szCs w:val="24"/>
-      <w:lang/>
     </w:rPr>
   </w:style>
   <w:style w:type="character" w:customStyle="1" w:styleId="ds-markdown-html">
@@ -6917,6 +7339,47 @@
     <w:name w:val="vlist-s"/>
     <w:basedOn w:val="a0"/>
     <w:rsid w:val="00844BD5"/>
+  </w:style>
+  <w:style w:type="paragraph" w:styleId="a5">
+    <w:name w:val="Intense Quote"/>
+    <w:basedOn w:val="a"/>
+    <w:next w:val="a"/>
+    <w:link w:val="a6"/>
+    <w:uiPriority w:val="30"/>
+    <w:qFormat/>
+    <w:rsid w:val="0037455A"/>
+    <w:pPr>
+      <w:pBdr>
+        <w:bottom w:val="single" w:sz="4" w:space="4" w:color="4472C4" w:themeColor="accent1"/>
+      </w:pBdr>
+      <w:spacing w:before="200" w:after="280" w:line="276" w:lineRule="auto"/>
+      <w:ind w:left="936" w:right="936"/>
+    </w:pPr>
+    <w:rPr>
+      <w:rFonts w:eastAsiaTheme="minorEastAsia"/>
+      <w:b/>
+      <w:bCs/>
+      <w:i/>
+      <w:iCs/>
+      <w:color w:val="4472C4" w:themeColor="accent1"/>
+      <w:lang w:val="en-US"/>
+    </w:rPr>
+  </w:style>
+  <w:style w:type="character" w:customStyle="1" w:styleId="a6">
+    <w:name w:val="Выделенная цитата Знак"/>
+    <w:basedOn w:val="a0"/>
+    <w:link w:val="a5"/>
+    <w:uiPriority w:val="30"/>
+    <w:rsid w:val="0037455A"/>
+    <w:rPr>
+      <w:rFonts w:eastAsiaTheme="minorEastAsia"/>
+      <w:b/>
+      <w:bCs/>
+      <w:i/>
+      <w:iCs/>
+      <w:color w:val="4472C4" w:themeColor="accent1"/>
+      <w:lang w:val="en-US"/>
+    </w:rPr>
   </w:style>
 </w:styles>
 </file>

</xml_diff>